<commit_message>
Fill the Assignment 2 report with evidence from the running stack
Replaces every "EVIDENCE TO ADD" box with real output: the reliability
demo log, gRPC client success/failure, Swagger 201 and replay, Kibana
search by request id across the gRPC boundary, Prometheus targets and
the HTTP-vs-gRPC Grafana dashboard. Corrects the rate-limit wording:
refused attempts count toward the window too.

Fixes scripts/demo_reliability.sh on Windows: Git Bash rewrote
FAULT_PATH_PREFIX into a Windows path, so no fault ever fired. The run
is now 30 calls so it outlasts the recovery period, and the caller's
output is appended so the stop/start markers are not overwritten.

Co-Authored-By: Claude Opus 5.5 <noreply@anthropic.com>
</commit_message>
<xml_diff>
--- a/docs/Assignment2-HTTP-gRPC-Metrics.docx
+++ b/docs/Assignment2-HTTP-gRPC-Metrics.docx
@@ -188,7 +188,7 @@
     <w:sdt>
       <w:sdtPr>
         <w:alias w:val="Contents"/>
-        <w:id w:val="-731008197"/>
+        <w:id w:val="1570774283"/>
       </w:sdtPr>
       <w:sdtEndPr/>
       <w:sdtContent>
@@ -211,7 +211,7 @@
           <w:r>
             <w:fldChar w:fldCharType="separate"/>
           </w:r>
-          <w:hyperlink w:anchor="_Toc243521908" w:history="1">
+          <w:hyperlink w:anchor="_Toc243523444" w:history="1">
             <w:r>
               <w:rPr>
                 <w:rStyle w:val="Hyperlink"/>
@@ -235,7 +235,7 @@
               <w:rPr>
                 <w:noProof/>
               </w:rPr>
-              <w:instrText xml:space="preserve"> PAGEREF _Toc243521908 \h </w:instrText>
+              <w:instrText xml:space="preserve"> PAGEREF _Toc243523444 \h </w:instrText>
             </w:r>
             <w:r>
               <w:rPr>
@@ -272,7 +272,7 @@
               <w:noProof/>
             </w:rPr>
           </w:pPr>
-          <w:hyperlink w:anchor="_Toc243521909" w:history="1">
+          <w:hyperlink w:anchor="_Toc243523445" w:history="1">
             <w:r>
               <w:rPr>
                 <w:rStyle w:val="Hyperlink"/>
@@ -296,7 +296,7 @@
               <w:rPr>
                 <w:noProof/>
               </w:rPr>
-              <w:instrText xml:space="preserve"> PAGEREF _Toc243521909 \h </w:instrText>
+              <w:instrText xml:space="preserve"> PAGEREF _Toc243523445 \h </w:instrText>
             </w:r>
             <w:r>
               <w:rPr>
@@ -333,7 +333,7 @@
               <w:noProof/>
             </w:rPr>
           </w:pPr>
-          <w:hyperlink w:anchor="_Toc243521910" w:history="1">
+          <w:hyperlink w:anchor="_Toc243523446" w:history="1">
             <w:r>
               <w:rPr>
                 <w:rStyle w:val="Hyperlink"/>
@@ -357,7 +357,7 @@
               <w:rPr>
                 <w:noProof/>
               </w:rPr>
-              <w:instrText xml:space="preserve"> PAGEREF _Toc243521910 \h </w:instrText>
+              <w:instrText xml:space="preserve"> PAGEREF _Toc243523446 \h </w:instrText>
             </w:r>
             <w:r>
               <w:rPr>
@@ -394,7 +394,7 @@
               <w:noProof/>
             </w:rPr>
           </w:pPr>
-          <w:hyperlink w:anchor="_Toc243521911" w:history="1">
+          <w:hyperlink w:anchor="_Toc243523447" w:history="1">
             <w:r>
               <w:rPr>
                 <w:rStyle w:val="Hyperlink"/>
@@ -418,7 +418,7 @@
               <w:rPr>
                 <w:noProof/>
               </w:rPr>
-              <w:instrText xml:space="preserve"> PAGEREF _Toc243521911 \h </w:instrText>
+              <w:instrText xml:space="preserve"> PAGEREF _Toc243523447 \h </w:instrText>
             </w:r>
             <w:r>
               <w:rPr>
@@ -455,7 +455,7 @@
               <w:noProof/>
             </w:rPr>
           </w:pPr>
-          <w:hyperlink w:anchor="_Toc243521912" w:history="1">
+          <w:hyperlink w:anchor="_Toc243523448" w:history="1">
             <w:r>
               <w:rPr>
                 <w:rStyle w:val="Hyperlink"/>
@@ -479,7 +479,7 @@
               <w:rPr>
                 <w:noProof/>
               </w:rPr>
-              <w:instrText xml:space="preserve"> PAGEREF _Toc243521912 \h </w:instrText>
+              <w:instrText xml:space="preserve"> PAGEREF _Toc243523448 \h </w:instrText>
             </w:r>
             <w:r>
               <w:rPr>
@@ -496,7 +496,7 @@
               <w:rPr>
                 <w:noProof/>
               </w:rPr>
-              <w:t>4</w:t>
+              <w:t>6</w:t>
             </w:r>
             <w:r>
               <w:rPr>
@@ -516,7 +516,7 @@
               <w:noProof/>
             </w:rPr>
           </w:pPr>
-          <w:hyperlink w:anchor="_Toc243521913" w:history="1">
+          <w:hyperlink w:anchor="_Toc243523449" w:history="1">
             <w:r>
               <w:rPr>
                 <w:rStyle w:val="Hyperlink"/>
@@ -540,7 +540,7 @@
               <w:rPr>
                 <w:noProof/>
               </w:rPr>
-              <w:instrText xml:space="preserve"> PAGEREF _Toc243521913 \h </w:instrText>
+              <w:instrText xml:space="preserve"> PAGEREF _Toc243523449 \h </w:instrText>
             </w:r>
             <w:r>
               <w:rPr>
@@ -557,7 +557,7 @@
               <w:rPr>
                 <w:noProof/>
               </w:rPr>
-              <w:t>5</w:t>
+              <w:t>6</w:t>
             </w:r>
             <w:r>
               <w:rPr>
@@ -577,7 +577,7 @@
               <w:noProof/>
             </w:rPr>
           </w:pPr>
-          <w:hyperlink w:anchor="_Toc243521914" w:history="1">
+          <w:hyperlink w:anchor="_Toc243523450" w:history="1">
             <w:r>
               <w:rPr>
                 <w:rStyle w:val="Hyperlink"/>
@@ -601,7 +601,7 @@
               <w:rPr>
                 <w:noProof/>
               </w:rPr>
-              <w:instrText xml:space="preserve"> PAGEREF _Toc243521914 \h </w:instrText>
+              <w:instrText xml:space="preserve"> PAGEREF _Toc243523450 \h </w:instrText>
             </w:r>
             <w:r>
               <w:rPr>
@@ -618,7 +618,7 @@
               <w:rPr>
                 <w:noProof/>
               </w:rPr>
-              <w:t>5</w:t>
+              <w:t>7</w:t>
             </w:r>
             <w:r>
               <w:rPr>
@@ -638,7 +638,7 @@
               <w:noProof/>
             </w:rPr>
           </w:pPr>
-          <w:hyperlink w:anchor="_Toc243521915" w:history="1">
+          <w:hyperlink w:anchor="_Toc243523451" w:history="1">
             <w:r>
               <w:rPr>
                 <w:rStyle w:val="Hyperlink"/>
@@ -662,7 +662,7 @@
               <w:rPr>
                 <w:noProof/>
               </w:rPr>
-              <w:instrText xml:space="preserve"> PAGEREF _Toc243521915 \h </w:instrText>
+              <w:instrText xml:space="preserve"> PAGEREF _Toc243523451 \h </w:instrText>
             </w:r>
             <w:r>
               <w:rPr>
@@ -679,7 +679,7 @@
               <w:rPr>
                 <w:noProof/>
               </w:rPr>
-              <w:t>6</w:t>
+              <w:t>8</w:t>
             </w:r>
             <w:r>
               <w:rPr>
@@ -699,7 +699,7 @@
               <w:noProof/>
             </w:rPr>
           </w:pPr>
-          <w:hyperlink w:anchor="_Toc243521916" w:history="1">
+          <w:hyperlink w:anchor="_Toc243523452" w:history="1">
             <w:r>
               <w:rPr>
                 <w:rStyle w:val="Hyperlink"/>
@@ -723,7 +723,7 @@
               <w:rPr>
                 <w:noProof/>
               </w:rPr>
-              <w:instrText xml:space="preserve"> PAGEREF _Toc243521916 \h </w:instrText>
+              <w:instrText xml:space="preserve"> PAGEREF _Toc243523452 \h </w:instrText>
             </w:r>
             <w:r>
               <w:rPr>
@@ -740,7 +740,7 @@
               <w:rPr>
                 <w:noProof/>
               </w:rPr>
-              <w:t>8</w:t>
+              <w:t>11</w:t>
             </w:r>
             <w:r>
               <w:rPr>
@@ -760,7 +760,7 @@
               <w:noProof/>
             </w:rPr>
           </w:pPr>
-          <w:hyperlink w:anchor="_Toc243521917" w:history="1">
+          <w:hyperlink w:anchor="_Toc243523453" w:history="1">
             <w:r>
               <w:rPr>
                 <w:rStyle w:val="Hyperlink"/>
@@ -784,7 +784,7 @@
               <w:rPr>
                 <w:noProof/>
               </w:rPr>
-              <w:instrText xml:space="preserve"> PAGEREF _Toc243521917 \h </w:instrText>
+              <w:instrText xml:space="preserve"> PAGEREF _Toc243523453 \h </w:instrText>
             </w:r>
             <w:r>
               <w:rPr>
@@ -801,7 +801,7 @@
               <w:rPr>
                 <w:noProof/>
               </w:rPr>
-              <w:t>8</w:t>
+              <w:t>11</w:t>
             </w:r>
             <w:r>
               <w:rPr>
@@ -821,7 +821,7 @@
               <w:noProof/>
             </w:rPr>
           </w:pPr>
-          <w:hyperlink w:anchor="_Toc243521918" w:history="1">
+          <w:hyperlink w:anchor="_Toc243523454" w:history="1">
             <w:r>
               <w:rPr>
                 <w:rStyle w:val="Hyperlink"/>
@@ -845,7 +845,7 @@
               <w:rPr>
                 <w:noProof/>
               </w:rPr>
-              <w:instrText xml:space="preserve"> PAGEREF _Toc243521918 \h </w:instrText>
+              <w:instrText xml:space="preserve"> PAGEREF _Toc243523454 \h </w:instrText>
             </w:r>
             <w:r>
               <w:rPr>
@@ -862,7 +862,7 @@
               <w:rPr>
                 <w:noProof/>
               </w:rPr>
-              <w:t>8</w:t>
+              <w:t>11</w:t>
             </w:r>
             <w:r>
               <w:rPr>
@@ -882,7 +882,7 @@
               <w:noProof/>
             </w:rPr>
           </w:pPr>
-          <w:hyperlink w:anchor="_Toc243521919" w:history="1">
+          <w:hyperlink w:anchor="_Toc243523455" w:history="1">
             <w:r>
               <w:rPr>
                 <w:rStyle w:val="Hyperlink"/>
@@ -906,7 +906,7 @@
               <w:rPr>
                 <w:noProof/>
               </w:rPr>
-              <w:instrText xml:space="preserve"> PAGEREF _Toc243521919 \h </w:instrText>
+              <w:instrText xml:space="preserve"> PAGEREF _Toc243523455 \h </w:instrText>
             </w:r>
             <w:r>
               <w:rPr>
@@ -923,7 +923,7 @@
               <w:rPr>
                 <w:noProof/>
               </w:rPr>
-              <w:t>8</w:t>
+              <w:t>11</w:t>
             </w:r>
             <w:r>
               <w:rPr>
@@ -943,7 +943,7 @@
               <w:noProof/>
             </w:rPr>
           </w:pPr>
-          <w:hyperlink w:anchor="_Toc243521920" w:history="1">
+          <w:hyperlink w:anchor="_Toc243523456" w:history="1">
             <w:r>
               <w:rPr>
                 <w:rStyle w:val="Hyperlink"/>
@@ -967,7 +967,7 @@
               <w:rPr>
                 <w:noProof/>
               </w:rPr>
-              <w:instrText xml:space="preserve"> PAGEREF _Toc243521920 \h </w:instrText>
+              <w:instrText xml:space="preserve"> PAGEREF _Toc243523456 \h </w:instrText>
             </w:r>
             <w:r>
               <w:rPr>
@@ -984,7 +984,7 @@
               <w:rPr>
                 <w:noProof/>
               </w:rPr>
-              <w:t>9</w:t>
+              <w:t>12</w:t>
             </w:r>
             <w:r>
               <w:rPr>
@@ -1004,7 +1004,7 @@
               <w:noProof/>
             </w:rPr>
           </w:pPr>
-          <w:hyperlink w:anchor="_Toc243521921" w:history="1">
+          <w:hyperlink w:anchor="_Toc243523457" w:history="1">
             <w:r>
               <w:rPr>
                 <w:rStyle w:val="Hyperlink"/>
@@ -1028,7 +1028,7 @@
               <w:rPr>
                 <w:noProof/>
               </w:rPr>
-              <w:instrText xml:space="preserve"> PAGEREF _Toc243521921 \h </w:instrText>
+              <w:instrText xml:space="preserve"> PAGEREF _Toc243523457 \h </w:instrText>
             </w:r>
             <w:r>
               <w:rPr>
@@ -1045,7 +1045,7 @@
               <w:rPr>
                 <w:noProof/>
               </w:rPr>
-              <w:t>10</w:t>
+              <w:t>13</w:t>
             </w:r>
             <w:r>
               <w:rPr>
@@ -1065,7 +1065,7 @@
               <w:noProof/>
             </w:rPr>
           </w:pPr>
-          <w:hyperlink w:anchor="_Toc243521922" w:history="1">
+          <w:hyperlink w:anchor="_Toc243523458" w:history="1">
             <w:r>
               <w:rPr>
                 <w:rStyle w:val="Hyperlink"/>
@@ -1089,7 +1089,7 @@
               <w:rPr>
                 <w:noProof/>
               </w:rPr>
-              <w:instrText xml:space="preserve"> PAGEREF _Toc243521922 \h </w:instrText>
+              <w:instrText xml:space="preserve"> PAGEREF _Toc243523458 \h </w:instrText>
             </w:r>
             <w:r>
               <w:rPr>
@@ -1106,7 +1106,7 @@
               <w:rPr>
                 <w:noProof/>
               </w:rPr>
-              <w:t>10</w:t>
+              <w:t>13</w:t>
             </w:r>
             <w:r>
               <w:rPr>
@@ -1126,7 +1126,7 @@
               <w:noProof/>
             </w:rPr>
           </w:pPr>
-          <w:hyperlink w:anchor="_Toc243521923" w:history="1">
+          <w:hyperlink w:anchor="_Toc243523459" w:history="1">
             <w:r>
               <w:rPr>
                 <w:rStyle w:val="Hyperlink"/>
@@ -1150,7 +1150,7 @@
               <w:rPr>
                 <w:noProof/>
               </w:rPr>
-              <w:instrText xml:space="preserve"> PAGEREF _Toc243521923 \h </w:instrText>
+              <w:instrText xml:space="preserve"> PAGEREF _Toc243523459 \h </w:instrText>
             </w:r>
             <w:r>
               <w:rPr>
@@ -1167,7 +1167,7 @@
               <w:rPr>
                 <w:noProof/>
               </w:rPr>
-              <w:t>11</w:t>
+              <w:t>15</w:t>
             </w:r>
             <w:r>
               <w:rPr>
@@ -1187,7 +1187,7 @@
               <w:noProof/>
             </w:rPr>
           </w:pPr>
-          <w:hyperlink w:anchor="_Toc243521924" w:history="1">
+          <w:hyperlink w:anchor="_Toc243523460" w:history="1">
             <w:r>
               <w:rPr>
                 <w:rStyle w:val="Hyperlink"/>
@@ -1211,7 +1211,7 @@
               <w:rPr>
                 <w:noProof/>
               </w:rPr>
-              <w:instrText xml:space="preserve"> PAGEREF _Toc243521924 \h </w:instrText>
+              <w:instrText xml:space="preserve"> PAGEREF _Toc243523460 \h </w:instrText>
             </w:r>
             <w:r>
               <w:rPr>
@@ -1228,7 +1228,7 @@
               <w:rPr>
                 <w:noProof/>
               </w:rPr>
-              <w:t>11</w:t>
+              <w:t>15</w:t>
             </w:r>
             <w:r>
               <w:rPr>
@@ -1248,7 +1248,7 @@
               <w:noProof/>
             </w:rPr>
           </w:pPr>
-          <w:hyperlink w:anchor="_Toc243521925" w:history="1">
+          <w:hyperlink w:anchor="_Toc243523461" w:history="1">
             <w:r>
               <w:rPr>
                 <w:rStyle w:val="Hyperlink"/>
@@ -1272,7 +1272,7 @@
               <w:rPr>
                 <w:noProof/>
               </w:rPr>
-              <w:instrText xml:space="preserve"> PAGEREF _Toc243521925 \h </w:instrText>
+              <w:instrText xml:space="preserve"> PAGEREF _Toc243523461 \h </w:instrText>
             </w:r>
             <w:r>
               <w:rPr>
@@ -1289,7 +1289,7 @@
               <w:rPr>
                 <w:noProof/>
               </w:rPr>
-              <w:t>11</w:t>
+              <w:t>15</w:t>
             </w:r>
             <w:r>
               <w:rPr>
@@ -1309,7 +1309,7 @@
               <w:noProof/>
             </w:rPr>
           </w:pPr>
-          <w:hyperlink w:anchor="_Toc243521926" w:history="1">
+          <w:hyperlink w:anchor="_Toc243523462" w:history="1">
             <w:r>
               <w:rPr>
                 <w:rStyle w:val="Hyperlink"/>
@@ -1333,7 +1333,7 @@
               <w:rPr>
                 <w:noProof/>
               </w:rPr>
-              <w:instrText xml:space="preserve"> PAGEREF _Toc243521926 \h </w:instrText>
+              <w:instrText xml:space="preserve"> PAGEREF _Toc243523462 \h </w:instrText>
             </w:r>
             <w:r>
               <w:rPr>
@@ -1350,7 +1350,7 @@
               <w:rPr>
                 <w:noProof/>
               </w:rPr>
-              <w:t>12</w:t>
+              <w:t>16</w:t>
             </w:r>
             <w:r>
               <w:rPr>
@@ -1370,7 +1370,7 @@
               <w:noProof/>
             </w:rPr>
           </w:pPr>
-          <w:hyperlink w:anchor="_Toc243521927" w:history="1">
+          <w:hyperlink w:anchor="_Toc243523463" w:history="1">
             <w:r>
               <w:rPr>
                 <w:rStyle w:val="Hyperlink"/>
@@ -1394,7 +1394,7 @@
               <w:rPr>
                 <w:noProof/>
               </w:rPr>
-              <w:instrText xml:space="preserve"> PAGEREF _Toc243521927 \h </w:instrText>
+              <w:instrText xml:space="preserve"> PAGEREF _Toc243523463 \h </w:instrText>
             </w:r>
             <w:r>
               <w:rPr>
@@ -1411,7 +1411,7 @@
               <w:rPr>
                 <w:noProof/>
               </w:rPr>
-              <w:t>14</w:t>
+              <w:t>19</w:t>
             </w:r>
             <w:r>
               <w:rPr>
@@ -1431,7 +1431,7 @@
               <w:noProof/>
             </w:rPr>
           </w:pPr>
-          <w:hyperlink w:anchor="_Toc243521928" w:history="1">
+          <w:hyperlink w:anchor="_Toc243523464" w:history="1">
             <w:r>
               <w:rPr>
                 <w:rStyle w:val="Hyperlink"/>
@@ -1455,7 +1455,7 @@
               <w:rPr>
                 <w:noProof/>
               </w:rPr>
-              <w:instrText xml:space="preserve"> PAGEREF _Toc243521928 \h </w:instrText>
+              <w:instrText xml:space="preserve"> PAGEREF _Toc243523464 \h </w:instrText>
             </w:r>
             <w:r>
               <w:rPr>
@@ -1472,7 +1472,7 @@
               <w:rPr>
                 <w:noProof/>
               </w:rPr>
-              <w:t>14</w:t>
+              <w:t>19</w:t>
             </w:r>
             <w:r>
               <w:rPr>
@@ -1498,7 +1498,7 @@
       <w:pPr>
         <w:pStyle w:val="Heading1"/>
       </w:pPr>
-      <w:bookmarkStart w:id="0" w:name="_Toc243521908"/>
+      <w:bookmarkStart w:id="0" w:name="_Toc243523444"/>
       <w:r>
         <w:t>Part A: Improving the HTTP API</w:t>
       </w:r>
@@ -1509,7 +1509,7 @@
         <w:pStyle w:val="Heading2"/>
         <w:keepNext/>
       </w:pPr>
-      <w:bookmarkStart w:id="1" w:name="_Toc243521909"/>
+      <w:bookmarkStart w:id="1" w:name="_Toc243523445"/>
       <w:r>
         <w:t>A.1 REST constraints</w:t>
       </w:r>
@@ -2362,7 +2362,7 @@
         <w:pStyle w:val="Heading2"/>
         <w:keepNext/>
       </w:pPr>
-      <w:bookmarkStart w:id="2" w:name="_Toc243521910"/>
+      <w:bookmarkStart w:id="2" w:name="_Toc243523446"/>
       <w:r>
         <w:t>A.2 Endpoint review</w:t>
       </w:r>
@@ -2698,7 +2698,7 @@
         <w:pStyle w:val="Heading2"/>
         <w:keepNext/>
       </w:pPr>
-      <w:bookmarkStart w:id="3" w:name="_Toc243521911"/>
+      <w:bookmarkStart w:id="3" w:name="_Toc243523447"/>
       <w:r>
         <w:t>A.3 OpenAPI specification</w:t>
       </w:r>
@@ -2939,26 +2939,130 @@
     </w:p>
     <w:p>
       <w:pPr>
-        <w:pBdr>
-          <w:left w:val="single" w:sz="18" w:space="6" w:color="BF9000"/>
-        </w:pBdr>
-        <w:shd w:val="clear" w:color="auto" w:fill="FFF2CC"/>
-        <w:spacing w:before="80" w:after="200"/>
-        <w:ind w:left="160"/>
-      </w:pPr>
-      <w:r>
-        <w:rPr>
-          <w:b/>
-          <w:bCs/>
-          <w:color w:val="9C5700"/>
-        </w:rPr>
-        <w:t xml:space="preserve">EVIDENCE TO ADD: </w:t>
-      </w:r>
-      <w:r>
-        <w:rPr>
-          <w:color w:val="9C5700"/>
-        </w:rPr>
-        <w:t>screenshot of Swagger UI showing the POST /api/sessions/{session_id}/sets request and its 201 response (and the 200 replay).</w:t>
+        <w:spacing w:after="60"/>
+        <w:jc w:val="center"/>
+      </w:pPr>
+      <w:r>
+        <w:rPr>
+          <w:noProof/>
+        </w:rPr>
+        <w:drawing>
+          <wp:inline distT="0" distB="0" distL="0" distR="0" wp14:anchorId="5BBD5E14" wp14:editId="5BBD5E15">
+            <wp:extent cx="4953000" cy="4619625"/>
+            <wp:effectExtent l="0" t="0" r="0" b="0"/>
+            <wp:docPr id="1" name="Picture 1"/>
+            <wp:cNvGraphicFramePr>
+              <a:graphicFrameLocks xmlns:a="http://schemas.openxmlformats.org/drawingml/2006/main" noChangeAspect="1"/>
+            </wp:cNvGraphicFramePr>
+            <a:graphic xmlns:a="http://schemas.openxmlformats.org/drawingml/2006/main">
+              <a:graphicData uri="http://schemas.openxmlformats.org/drawingml/2006/picture">
+                <pic:pic xmlns:pic="http://schemas.openxmlformats.org/drawingml/2006/picture">
+                  <pic:nvPicPr>
+                    <pic:cNvPr id="0" name=""/>
+                    <pic:cNvPicPr>
+                      <a:picLocks noChangeAspect="1" noChangeArrowheads="1"/>
+                    </pic:cNvPicPr>
+                  </pic:nvPicPr>
+                  <pic:blipFill>
+                    <a:blip r:embed="rId7"/>
+                    <a:srcRect/>
+                    <a:stretch>
+                      <a:fillRect/>
+                    </a:stretch>
+                  </pic:blipFill>
+                  <pic:spPr bwMode="auto">
+                    <a:xfrm>
+                      <a:off x="0" y="0"/>
+                      <a:ext cx="4953000" cy="4619625"/>
+                    </a:xfrm>
+                    <a:prstGeom prst="rect">
+                      <a:avLst/>
+                    </a:prstGeom>
+                  </pic:spPr>
+                </pic:pic>
+              </a:graphicData>
+            </a:graphic>
+          </wp:inline>
+        </w:drawing>
+      </w:r>
+    </w:p>
+    <w:p>
+      <w:pPr>
+        <w:spacing w:after="200"/>
+      </w:pPr>
+      <w:r>
+        <w:rPr>
+          <w:i/>
+          <w:iCs/>
+          <w:color w:val="555555"/>
+          <w:sz w:val="18"/>
+          <w:szCs w:val="18"/>
+        </w:rPr>
+        <w:t>Figure A.1. Swagger UI, Try it out on POST /api/sessions/{session_id}/sets with Idempotency-Key swagger-demo-1: 201, set log_id 134. (Basic credentials for the demo account were sent by the browser, which is why the generated curl line has no Authorization header.)</w:t>
+      </w:r>
+    </w:p>
+    <w:p>
+      <w:pPr>
+        <w:spacing w:after="60"/>
+        <w:jc w:val="center"/>
+      </w:pPr>
+      <w:r>
+        <w:rPr>
+          <w:noProof/>
+        </w:rPr>
+        <w:drawing>
+          <wp:inline distT="0" distB="0" distL="0" distR="0" wp14:anchorId="5BBD5E16" wp14:editId="5BBD5E17">
+            <wp:extent cx="5334000" cy="2771775"/>
+            <wp:effectExtent l="0" t="0" r="0" b="0"/>
+            <wp:docPr id="2" name="Picture 2"/>
+            <wp:cNvGraphicFramePr>
+              <a:graphicFrameLocks xmlns:a="http://schemas.openxmlformats.org/drawingml/2006/main" noChangeAspect="1"/>
+            </wp:cNvGraphicFramePr>
+            <a:graphic xmlns:a="http://schemas.openxmlformats.org/drawingml/2006/main">
+              <a:graphicData uri="http://schemas.openxmlformats.org/drawingml/2006/picture">
+                <pic:pic xmlns:pic="http://schemas.openxmlformats.org/drawingml/2006/picture">
+                  <pic:nvPicPr>
+                    <pic:cNvPr id="0" name=""/>
+                    <pic:cNvPicPr>
+                      <a:picLocks noChangeAspect="1" noChangeArrowheads="1"/>
+                    </pic:cNvPicPr>
+                  </pic:nvPicPr>
+                  <pic:blipFill>
+                    <a:blip r:embed="rId8"/>
+                    <a:srcRect/>
+                    <a:stretch>
+                      <a:fillRect/>
+                    </a:stretch>
+                  </pic:blipFill>
+                  <pic:spPr bwMode="auto">
+                    <a:xfrm>
+                      <a:off x="0" y="0"/>
+                      <a:ext cx="5334000" cy="2771775"/>
+                    </a:xfrm>
+                    <a:prstGeom prst="rect">
+                      <a:avLst/>
+                    </a:prstGeom>
+                  </pic:spPr>
+                </pic:pic>
+              </a:graphicData>
+            </a:graphic>
+          </wp:inline>
+        </w:drawing>
+      </w:r>
+    </w:p>
+    <w:p>
+      <w:pPr>
+        <w:spacing w:after="200"/>
+      </w:pPr>
+      <w:r>
+        <w:rPr>
+          <w:i/>
+          <w:iCs/>
+          <w:color w:val="555555"/>
+          <w:sz w:val="18"/>
+          <w:szCs w:val="18"/>
+        </w:rPr>
+        <w:t>Figure A.2. The same request executed again with the same key: 200, the same log_id 134, and the response header idempotent-replayed: true. Nothing new was written.</w:t>
       </w:r>
     </w:p>
     <w:p>
@@ -2966,7 +3070,7 @@
         <w:pStyle w:val="Heading2"/>
         <w:keepNext/>
       </w:pPr>
-      <w:bookmarkStart w:id="4" w:name="_Toc243521912"/>
+      <w:bookmarkStart w:id="4" w:name="_Toc243523448"/>
       <w:r>
         <w:t>A.4 Idempotency (safe repeats)</w:t>
       </w:r>
@@ -3205,7 +3309,7 @@
         <w:pStyle w:val="Heading2"/>
         <w:keepNext/>
       </w:pPr>
-      <w:bookmarkStart w:id="5" w:name="_Toc243521913"/>
+      <w:bookmarkStart w:id="5" w:name="_Toc243523449"/>
       <w:r>
         <w:t>A.5 Rate limiting</w:t>
       </w:r>
@@ -3562,7 +3666,7 @@
                 <w:sz w:val="18"/>
                 <w:szCs w:val="18"/>
               </w:rPr>
-              <w:t xml:space="preserve">When the oldest counted call leaves the 60 s window. </w:t>
+              <w:t xml:space="preserve">Every attempt is counted, refused ones included, so a client that keeps calling stays refused. </w:t>
             </w:r>
             <w:r>
               <w:rPr>
@@ -3577,7 +3681,7 @@
                 <w:sz w:val="18"/>
                 <w:szCs w:val="18"/>
               </w:rPr>
-              <w:t xml:space="preserve"> carries that many whole seconds, rounded up so a client that waits exactly that long is not refused again (</w:t>
+              <w:t xml:space="preserve"> is the number of whole seconds until enough attempts have left the 60 s window to bring the count under the limit, rounded up, so a client that stops and waits that long is accepted (</w:t>
             </w:r>
             <w:r>
               <w:rPr>
@@ -3592,7 +3696,7 @@
                 <w:sz w:val="18"/>
                 <w:szCs w:val="18"/>
               </w:rPr>
-              <w:t>).</w:t>
+              <w:t>). That is why the two refused calls below both say 60 s.</w:t>
             </w:r>
           </w:p>
         </w:tc>
@@ -3819,7 +3923,7 @@
           <w:sz w:val="17"/>
           <w:szCs w:val="17"/>
         </w:rPr>
-        <w:t xml:space="preserve">  call 1: 200  {"rebuilt":3}</w:t>
+        <w:t xml:space="preserve">  call 1: 200  {"rebuilt":15}</w:t>
       </w:r>
     </w:p>
     <w:p>
@@ -3834,7 +3938,7 @@
           <w:sz w:val="17"/>
           <w:szCs w:val="17"/>
         </w:rPr>
-        <w:t xml:space="preserve">  call 2: 200  {"rebuilt":3}</w:t>
+        <w:t xml:space="preserve">  call 2: 200  {"rebuilt":15}</w:t>
       </w:r>
     </w:p>
     <w:p>
@@ -3849,7 +3953,7 @@
           <w:sz w:val="17"/>
           <w:szCs w:val="17"/>
         </w:rPr>
-        <w:t xml:space="preserve">  call 3: 200  {"rebuilt":3}</w:t>
+        <w:t xml:space="preserve">  call 3: 200  {"rebuilt":15}</w:t>
       </w:r>
     </w:p>
     <w:p>
@@ -3895,7 +3999,7 @@
         <w:pStyle w:val="Heading2"/>
         <w:keepNext/>
       </w:pPr>
-      <w:bookmarkStart w:id="6" w:name="_Toc243521914"/>
+      <w:bookmarkStart w:id="6" w:name="_Toc243523450"/>
       <w:r>
         <w:t>A.6 Before and after: logging a set</w:t>
       </w:r>
@@ -6430,7 +6534,7 @@
         <w:pStyle w:val="Heading2"/>
         <w:keepNext/>
       </w:pPr>
-      <w:bookmarkStart w:id="7" w:name="_Toc243521915"/>
+      <w:bookmarkStart w:id="7" w:name="_Toc243523451"/>
       <w:r>
         <w:t>A.7 The Python caller (timeout, retry, circuit breaker)</w:t>
       </w:r>
@@ -7353,81 +7457,1023 @@
     </w:p>
     <w:p>
       <w:pPr>
-        <w:pBdr>
-          <w:left w:val="single" w:sz="18" w:space="6" w:color="BF9000"/>
-        </w:pBdr>
-        <w:shd w:val="clear" w:color="auto" w:fill="FFF2CC"/>
-        <w:spacing w:before="80" w:after="200"/>
-        <w:ind w:left="160"/>
+        <w:spacing w:after="120"/>
       </w:pPr>
       <w:r>
         <w:rPr>
           <w:b/>
           <w:bCs/>
-          <w:color w:val="9C5700"/>
-        </w:rPr>
-        <w:t xml:space="preserve">EVIDENCE TO ADD: </w:t>
-      </w:r>
-      <w:r>
-        <w:rPr>
-          <w:color w:val="9C5700"/>
-        </w:rPr>
-        <w:t>run ./scripts/demo_reliability.sh with the stack up and paste the contents of observability/results-a2/reliability.txt here. It should show: sets written, a timeout followed by 'retrying in …s', 'breaker OPEN', several 'blocked: circuit open', 'breaker HALF_OPEN', 'breaker CLOSED', and the final summary line.</w:t>
-      </w:r>
-    </w:p>
-    <w:p>
-      <w:r>
-        <w:br w:type="page"/>
-      </w:r>
-    </w:p>
-    <w:p>
-      <w:pPr>
-        <w:pStyle w:val="Heading1"/>
-      </w:pPr>
-      <w:bookmarkStart w:id="8" w:name="_Toc243521916"/>
-      <w:r>
-        <w:t>Part B: The gRPC service</w:t>
-      </w:r>
-      <w:bookmarkEnd w:id="8"/>
-    </w:p>
-    <w:p>
-      <w:pPr>
-        <w:pStyle w:val="Heading2"/>
+        </w:rPr>
+        <w:t>Output</w:t>
+      </w:r>
+      <w:r>
+        <w:t xml:space="preserve"> of </w:t>
+      </w:r>
+      <w:r>
+        <w:rPr>
+          <w:rFonts w:ascii="Consolas" w:eastAsia="Consolas" w:hAnsi="Consolas" w:cs="Consolas"/>
+          <w:sz w:val="19"/>
+          <w:szCs w:val="19"/>
+        </w:rPr>
+        <w:t>./scripts/demo_reliability.sh</w:t>
+      </w:r>
+      <w:r>
+        <w:t xml:space="preserve"> (saved as </w:t>
+      </w:r>
+      <w:r>
+        <w:rPr>
+          <w:rFonts w:ascii="Consolas" w:eastAsia="Consolas" w:hAnsi="Consolas" w:cs="Consolas"/>
+          <w:sz w:val="19"/>
+          <w:szCs w:val="19"/>
+        </w:rPr>
+        <w:t>observability/results-a2/reliability.txt</w:t>
+      </w:r>
+      <w:r>
+        <w:t xml:space="preserve">; the </w:t>
+      </w:r>
+      <w:r>
+        <w:rPr>
+          <w:rFonts w:ascii="Consolas" w:eastAsia="Consolas" w:hAnsi="Consolas" w:cs="Consolas"/>
+          <w:sz w:val="19"/>
+          <w:szCs w:val="19"/>
+        </w:rPr>
+        <w:t>&gt;&gt;&gt;</w:t>
+      </w:r>
+      <w:r>
+        <w:t xml:space="preserve"> lines are the script stopping and starting the app container):</w:t>
+      </w:r>
+    </w:p>
+    <w:p>
+      <w:pPr>
+        <w:shd w:val="clear" w:color="auto" w:fill="F2F2F2"/>
+        <w:spacing w:line="250" w:lineRule="auto"/>
+        <w:ind w:left="120" w:right="120"/>
+      </w:pPr>
+      <w:r>
+        <w:rPr>
+          <w:rFonts w:ascii="Consolas" w:eastAsia="Consolas" w:hAnsi="Consolas" w:cs="Consolas"/>
+          <w:sz w:val="13"/>
+          <w:szCs w:val="13"/>
+        </w:rPr>
+        <w:t>[00:55:31.484] settings: timeout 2.0s, 2 retries (backoff 0.5s doubling, +25% jitter), breaker opens after 3 consecutive failures and tries again after 10.0s</w:t>
+      </w:r>
+    </w:p>
+    <w:p>
+      <w:pPr>
+        <w:shd w:val="clear" w:color="auto" w:fill="F2F2F2"/>
+        <w:spacing w:line="250" w:lineRule="auto"/>
+        <w:ind w:left="120" w:right="120"/>
+      </w:pPr>
+      <w:r>
+        <w:rPr>
+          <w:rFonts w:ascii="Consolas" w:eastAsia="Consolas" w:hAnsi="Consolas" w:cs="Consolas"/>
+          <w:sz w:val="13"/>
+          <w:szCs w:val="13"/>
+        </w:rPr>
+        <w:t>[00:55:31.645] start workout attempt 1 -&gt; 201 (161 ms, request id fa6b4c9dc67c4a7d)</w:t>
+      </w:r>
+    </w:p>
+    <w:p>
+      <w:pPr>
+        <w:shd w:val="clear" w:color="auto" w:fill="F2F2F2"/>
+        <w:spacing w:line="250" w:lineRule="auto"/>
+        <w:ind w:left="120" w:right="120"/>
+      </w:pPr>
+      <w:r>
+        <w:rPr>
+          <w:rFonts w:ascii="Consolas" w:eastAsia="Consolas" w:hAnsi="Consolas" w:cs="Consolas"/>
+          <w:sz w:val="13"/>
+          <w:szCs w:val="13"/>
+        </w:rPr>
+        <w:t>[00:55:31.645] workout 2 is live</w:t>
+      </w:r>
+    </w:p>
+    <w:p>
+      <w:pPr>
+        <w:shd w:val="clear" w:color="auto" w:fill="F2F2F2"/>
+        <w:spacing w:line="250" w:lineRule="auto"/>
+        <w:ind w:left="120" w:right="120"/>
+      </w:pPr>
+      <w:r>
+        <w:rPr>
+          <w:rFonts w:ascii="Consolas" w:eastAsia="Consolas" w:hAnsi="Consolas" w:cs="Consolas"/>
+          <w:sz w:val="13"/>
+          <w:szCs w:val="13"/>
+        </w:rPr>
+        <w:t>[00:55:31.747] set 1 attempt 1 -&gt; 201 (102 ms, request id be9e94c3a61f40a6)</w:t>
+      </w:r>
+    </w:p>
+    <w:p>
+      <w:pPr>
+        <w:shd w:val="clear" w:color="auto" w:fill="F2F2F2"/>
+        <w:spacing w:line="250" w:lineRule="auto"/>
+        <w:ind w:left="120" w:right="120"/>
+      </w:pPr>
+      <w:r>
+        <w:rPr>
+          <w:rFonts w:ascii="Consolas" w:eastAsia="Consolas" w:hAnsi="Consolas" w:cs="Consolas"/>
+          <w:sz w:val="13"/>
+          <w:szCs w:val="13"/>
+        </w:rPr>
+        <w:t>[00:55:31.747] set 1 written: log_id 87, 62.5 × 8</w:t>
+      </w:r>
+    </w:p>
+    <w:p>
+      <w:pPr>
+        <w:shd w:val="clear" w:color="auto" w:fill="F2F2F2"/>
+        <w:spacing w:line="250" w:lineRule="auto"/>
+        <w:ind w:left="120" w:right="120"/>
+      </w:pPr>
+      <w:r>
+        <w:rPr>
+          <w:rFonts w:ascii="Consolas" w:eastAsia="Consolas" w:hAnsi="Consolas" w:cs="Consolas"/>
+          <w:sz w:val="13"/>
+          <w:szCs w:val="13"/>
+        </w:rPr>
+        <w:t>[00:55:32.836] set 2 attempt 1 -&gt; 201 (90 ms, request id 03afdf751e6e4b27)</w:t>
+      </w:r>
+    </w:p>
+    <w:p>
+      <w:pPr>
+        <w:shd w:val="clear" w:color="auto" w:fill="F2F2F2"/>
+        <w:spacing w:line="250" w:lineRule="auto"/>
+        <w:ind w:left="120" w:right="120"/>
+      </w:pPr>
+      <w:r>
+        <w:rPr>
+          <w:rFonts w:ascii="Consolas" w:eastAsia="Consolas" w:hAnsi="Consolas" w:cs="Consolas"/>
+          <w:sz w:val="13"/>
+          <w:szCs w:val="13"/>
+        </w:rPr>
+        <w:t>[00:55:32.836] set 2 written: log_id 88, 65 × 8</w:t>
+      </w:r>
+    </w:p>
+    <w:p>
+      <w:pPr>
+        <w:shd w:val="clear" w:color="auto" w:fill="F2F2F2"/>
+        <w:spacing w:line="250" w:lineRule="auto"/>
+        <w:ind w:left="120" w:right="120"/>
+      </w:pPr>
+      <w:r>
+        <w:rPr>
+          <w:rFonts w:ascii="Consolas" w:eastAsia="Consolas" w:hAnsi="Consolas" w:cs="Consolas"/>
+          <w:sz w:val="13"/>
+          <w:szCs w:val="13"/>
+        </w:rPr>
+        <w:t>[00:55:33.931] set 3 attempt 1 -&gt; 201 (94 ms, request id db72f05f1d944e8d)</w:t>
+      </w:r>
+    </w:p>
+    <w:p>
+      <w:pPr>
+        <w:shd w:val="clear" w:color="auto" w:fill="F2F2F2"/>
+        <w:spacing w:line="250" w:lineRule="auto"/>
+        <w:ind w:left="120" w:right="120"/>
+      </w:pPr>
+      <w:r>
+        <w:rPr>
+          <w:rFonts w:ascii="Consolas" w:eastAsia="Consolas" w:hAnsi="Consolas" w:cs="Consolas"/>
+          <w:sz w:val="13"/>
+          <w:szCs w:val="13"/>
+        </w:rPr>
+        <w:t>[00:55:33.931] set 3 written: log_id 89, 67.5 × 8</w:t>
+      </w:r>
+    </w:p>
+    <w:p>
+      <w:pPr>
+        <w:shd w:val="clear" w:color="auto" w:fill="F2F2F2"/>
+        <w:spacing w:line="250" w:lineRule="auto"/>
+        <w:ind w:left="120" w:right="120"/>
+      </w:pPr>
+      <w:r>
+        <w:rPr>
+          <w:rFonts w:ascii="Consolas" w:eastAsia="Consolas" w:hAnsi="Consolas" w:cs="Consolas"/>
+          <w:sz w:val="13"/>
+          <w:szCs w:val="13"/>
+        </w:rPr>
+        <w:t>[00:55:36.940] set 4 attempt 1 -&gt; timed out after 2.0s; retrying in 0.57s</w:t>
+      </w:r>
+    </w:p>
+    <w:p>
+      <w:pPr>
+        <w:shd w:val="clear" w:color="auto" w:fill="F2F2F2"/>
+        <w:spacing w:line="250" w:lineRule="auto"/>
+        <w:ind w:left="120" w:right="120"/>
+      </w:pPr>
+      <w:r>
+        <w:rPr>
+          <w:rFonts w:ascii="Consolas" w:eastAsia="Consolas" w:hAnsi="Consolas" w:cs="Consolas"/>
+          <w:sz w:val="13"/>
+          <w:szCs w:val="13"/>
+        </w:rPr>
+        <w:t>[00:55:37.611] set 4 attempt 2 -&gt; 201 (96 ms, request id 6dd04b09e38c4095)</w:t>
+      </w:r>
+    </w:p>
+    <w:p>
+      <w:pPr>
+        <w:shd w:val="clear" w:color="auto" w:fill="F2F2F2"/>
+        <w:spacing w:line="250" w:lineRule="auto"/>
+        <w:ind w:left="120" w:right="120"/>
+      </w:pPr>
+      <w:r>
+        <w:rPr>
+          <w:rFonts w:ascii="Consolas" w:eastAsia="Consolas" w:hAnsi="Consolas" w:cs="Consolas"/>
+          <w:sz w:val="13"/>
+          <w:szCs w:val="13"/>
+        </w:rPr>
+        <w:t>[00:55:37.611] set 4 written: log_id 90, 70 × 8</w:t>
+      </w:r>
+    </w:p>
+    <w:p>
+      <w:pPr>
+        <w:shd w:val="clear" w:color="auto" w:fill="F2F2F2"/>
+        <w:spacing w:line="250" w:lineRule="auto"/>
+        <w:ind w:left="120" w:right="120"/>
+      </w:pPr>
+      <w:r>
+        <w:rPr>
+          <w:rFonts w:ascii="Consolas" w:eastAsia="Consolas" w:hAnsi="Consolas" w:cs="Consolas"/>
+          <w:sz w:val="13"/>
+          <w:szCs w:val="13"/>
+        </w:rPr>
+        <w:t>[00:55:38.702] set 5 attempt 1 -&gt; 201 (90 ms, request id 551e9345ae354467)</w:t>
+      </w:r>
+    </w:p>
+    <w:p>
+      <w:pPr>
+        <w:shd w:val="clear" w:color="auto" w:fill="F2F2F2"/>
+        <w:spacing w:line="250" w:lineRule="auto"/>
+        <w:ind w:left="120" w:right="120"/>
+      </w:pPr>
+      <w:r>
+        <w:rPr>
+          <w:rFonts w:ascii="Consolas" w:eastAsia="Consolas" w:hAnsi="Consolas" w:cs="Consolas"/>
+          <w:sz w:val="13"/>
+          <w:szCs w:val="13"/>
+        </w:rPr>
+        <w:t>[00:55:38.702] set 5 written: log_id 91, 72.5 × 8</w:t>
+      </w:r>
+    </w:p>
+    <w:p>
+      <w:pPr>
+        <w:shd w:val="clear" w:color="auto" w:fill="F2F2F2"/>
+        <w:spacing w:line="250" w:lineRule="auto"/>
+        <w:ind w:left="120" w:right="120"/>
+      </w:pPr>
+      <w:r>
+        <w:rPr>
+          <w:rFonts w:ascii="Consolas" w:eastAsia="Consolas" w:hAnsi="Consolas" w:cs="Consolas"/>
+          <w:sz w:val="13"/>
+          <w:szCs w:val="13"/>
+        </w:rPr>
+        <w:t>&gt;&gt;&gt; stopping the app container</w:t>
+      </w:r>
+    </w:p>
+    <w:p>
+      <w:pPr>
+        <w:shd w:val="clear" w:color="auto" w:fill="F2F2F2"/>
+        <w:spacing w:line="250" w:lineRule="auto"/>
+        <w:ind w:left="120" w:right="120"/>
+      </w:pPr>
+      <w:r>
+        <w:rPr>
+          <w:rFonts w:ascii="Consolas" w:eastAsia="Consolas" w:hAnsi="Consolas" w:cs="Consolas"/>
+          <w:sz w:val="13"/>
+          <w:szCs w:val="13"/>
+        </w:rPr>
+        <w:t>[00:55:39.803] set 6 attempt 1 -&gt; 201 (101 ms, request id f2c0645dd14d40ed)</w:t>
+      </w:r>
+    </w:p>
+    <w:p>
+      <w:pPr>
+        <w:shd w:val="clear" w:color="auto" w:fill="F2F2F2"/>
+        <w:spacing w:line="250" w:lineRule="auto"/>
+        <w:ind w:left="120" w:right="120"/>
+      </w:pPr>
+      <w:r>
+        <w:rPr>
+          <w:rFonts w:ascii="Consolas" w:eastAsia="Consolas" w:hAnsi="Consolas" w:cs="Consolas"/>
+          <w:sz w:val="13"/>
+          <w:szCs w:val="13"/>
+        </w:rPr>
+        <w:t>[00:55:39.803] set 6 written: log_id 92, 75 × 8</w:t>
+      </w:r>
+    </w:p>
+    <w:p>
+      <w:pPr>
+        <w:shd w:val="clear" w:color="auto" w:fill="F2F2F2"/>
+        <w:spacing w:line="250" w:lineRule="auto"/>
+        <w:ind w:left="120" w:right="120"/>
+      </w:pPr>
+      <w:r>
+        <w:rPr>
+          <w:rFonts w:ascii="Consolas" w:eastAsia="Consolas" w:hAnsi="Consolas" w:cs="Consolas"/>
+          <w:sz w:val="13"/>
+          <w:szCs w:val="13"/>
+        </w:rPr>
+        <w:t>[00:55:40.826] set 7 attempt 1 -&gt; ReadError: [WinError 10053] An established connection was aborted by the software in your host machine; retrying in 0.59s</w:t>
+      </w:r>
+    </w:p>
+    <w:p>
+      <w:pPr>
+        <w:shd w:val="clear" w:color="auto" w:fill="F2F2F2"/>
+        <w:spacing w:line="250" w:lineRule="auto"/>
+        <w:ind w:left="120" w:right="120"/>
+      </w:pPr>
+      <w:r>
+        <w:rPr>
+          <w:rFonts w:ascii="Consolas" w:eastAsia="Consolas" w:hAnsi="Consolas" w:cs="Consolas"/>
+          <w:sz w:val="13"/>
+          <w:szCs w:val="13"/>
+        </w:rPr>
+        <w:t>[00:55:45.436] set 7 attempt 2 -&gt; timed out after 2.0s; retrying in 1.25s</w:t>
+      </w:r>
+    </w:p>
+    <w:p>
+      <w:pPr>
+        <w:shd w:val="clear" w:color="auto" w:fill="F2F2F2"/>
+        <w:spacing w:line="250" w:lineRule="auto"/>
+        <w:ind w:left="120" w:right="120"/>
+      </w:pPr>
+      <w:r>
+        <w:rPr>
+          <w:rFonts w:ascii="Consolas" w:eastAsia="Consolas" w:hAnsi="Consolas" w:cs="Consolas"/>
+          <w:sz w:val="13"/>
+          <w:szCs w:val="13"/>
+        </w:rPr>
+        <w:t>[00:55:50.705] breaker OPEN after 3 consecutive failure(s): blocking calls for 10s</w:t>
+      </w:r>
+    </w:p>
+    <w:p>
+      <w:pPr>
+        <w:shd w:val="clear" w:color="auto" w:fill="F2F2F2"/>
+        <w:spacing w:line="250" w:lineRule="auto"/>
+        <w:ind w:left="120" w:right="120"/>
+      </w:pPr>
+      <w:r>
+        <w:rPr>
+          <w:rFonts w:ascii="Consolas" w:eastAsia="Consolas" w:hAnsi="Consolas" w:cs="Consolas"/>
+          <w:sz w:val="13"/>
+          <w:szCs w:val="13"/>
+        </w:rPr>
+        <w:t>[00:55:50.705] set 7 attempt 3 -&gt; timed out after 2.0s; no retries left</w:t>
+      </w:r>
+    </w:p>
+    <w:p>
+      <w:pPr>
+        <w:shd w:val="clear" w:color="auto" w:fill="F2F2F2"/>
+        <w:spacing w:line="250" w:lineRule="auto"/>
+        <w:ind w:left="120" w:right="120"/>
+      </w:pPr>
+      <w:r>
+        <w:rPr>
+          <w:rFonts w:ascii="Consolas" w:eastAsia="Consolas" w:hAnsi="Consolas" w:cs="Consolas"/>
+          <w:sz w:val="13"/>
+          <w:szCs w:val="13"/>
+        </w:rPr>
+        <w:t>[00:55:50.705] set 7 failed: timed out after 2.0s</w:t>
+      </w:r>
+    </w:p>
+    <w:p>
+      <w:pPr>
+        <w:shd w:val="clear" w:color="auto" w:fill="F2F2F2"/>
+        <w:spacing w:line="250" w:lineRule="auto"/>
+        <w:ind w:left="120" w:right="120"/>
+      </w:pPr>
+      <w:r>
+        <w:rPr>
+          <w:rFonts w:ascii="Consolas" w:eastAsia="Consolas" w:hAnsi="Consolas" w:cs="Consolas"/>
+          <w:sz w:val="13"/>
+          <w:szCs w:val="13"/>
+        </w:rPr>
+        <w:t>[00:55:51.706] set 8 blocked: circuit open, 9.0s until a trial call</w:t>
+      </w:r>
+    </w:p>
+    <w:p>
+      <w:pPr>
+        <w:shd w:val="clear" w:color="auto" w:fill="F2F2F2"/>
+        <w:spacing w:line="250" w:lineRule="auto"/>
+        <w:ind w:left="120" w:right="120"/>
+      </w:pPr>
+      <w:r>
+        <w:rPr>
+          <w:rFonts w:ascii="Consolas" w:eastAsia="Consolas" w:hAnsi="Consolas" w:cs="Consolas"/>
+          <w:sz w:val="13"/>
+          <w:szCs w:val="13"/>
+        </w:rPr>
+        <w:t>[00:55:52.706] set 9 blocked: circuit open, 8.0s until a trial call</w:t>
+      </w:r>
+    </w:p>
+    <w:p>
+      <w:pPr>
+        <w:shd w:val="clear" w:color="auto" w:fill="F2F2F2"/>
+        <w:spacing w:line="250" w:lineRule="auto"/>
+        <w:ind w:left="120" w:right="120"/>
+      </w:pPr>
+      <w:r>
+        <w:rPr>
+          <w:rFonts w:ascii="Consolas" w:eastAsia="Consolas" w:hAnsi="Consolas" w:cs="Consolas"/>
+          <w:sz w:val="13"/>
+          <w:szCs w:val="13"/>
+        </w:rPr>
+        <w:t>&gt;&gt;&gt; starting the app container</w:t>
+      </w:r>
+    </w:p>
+    <w:p>
+      <w:pPr>
+        <w:shd w:val="clear" w:color="auto" w:fill="F2F2F2"/>
+        <w:spacing w:line="250" w:lineRule="auto"/>
+        <w:ind w:left="120" w:right="120"/>
+      </w:pPr>
+      <w:r>
+        <w:rPr>
+          <w:rFonts w:ascii="Consolas" w:eastAsia="Consolas" w:hAnsi="Consolas" w:cs="Consolas"/>
+          <w:sz w:val="13"/>
+          <w:szCs w:val="13"/>
+        </w:rPr>
+        <w:t>[00:55:53.707] set 10 blocked: circuit open, 7.0s until a trial call</w:t>
+      </w:r>
+    </w:p>
+    <w:p>
+      <w:pPr>
+        <w:shd w:val="clear" w:color="auto" w:fill="F2F2F2"/>
+        <w:spacing w:line="250" w:lineRule="auto"/>
+        <w:ind w:left="120" w:right="120"/>
+      </w:pPr>
+      <w:r>
+        <w:rPr>
+          <w:rFonts w:ascii="Consolas" w:eastAsia="Consolas" w:hAnsi="Consolas" w:cs="Consolas"/>
+          <w:sz w:val="13"/>
+          <w:szCs w:val="13"/>
+        </w:rPr>
+        <w:t>[00:55:54.707] set 11 blocked: circuit open, 6.0s until a trial call</w:t>
+      </w:r>
+    </w:p>
+    <w:p>
+      <w:pPr>
+        <w:shd w:val="clear" w:color="auto" w:fill="F2F2F2"/>
+        <w:spacing w:line="250" w:lineRule="auto"/>
+        <w:ind w:left="120" w:right="120"/>
+      </w:pPr>
+      <w:r>
+        <w:rPr>
+          <w:rFonts w:ascii="Consolas" w:eastAsia="Consolas" w:hAnsi="Consolas" w:cs="Consolas"/>
+          <w:sz w:val="13"/>
+          <w:szCs w:val="13"/>
+        </w:rPr>
+        <w:t>[00:55:55.708] set 12 blocked: circuit open, 5.0s until a trial call</w:t>
+      </w:r>
+    </w:p>
+    <w:p>
+      <w:pPr>
+        <w:shd w:val="clear" w:color="auto" w:fill="F2F2F2"/>
+        <w:spacing w:line="250" w:lineRule="auto"/>
+        <w:ind w:left="120" w:right="120"/>
+      </w:pPr>
+      <w:r>
+        <w:rPr>
+          <w:rFonts w:ascii="Consolas" w:eastAsia="Consolas" w:hAnsi="Consolas" w:cs="Consolas"/>
+          <w:sz w:val="13"/>
+          <w:szCs w:val="13"/>
+        </w:rPr>
+        <w:t>[00:55:56.708] set 13 blocked: circuit open, 4.0s until a trial call</w:t>
+      </w:r>
+    </w:p>
+    <w:p>
+      <w:pPr>
+        <w:shd w:val="clear" w:color="auto" w:fill="F2F2F2"/>
+        <w:spacing w:line="250" w:lineRule="auto"/>
+        <w:ind w:left="120" w:right="120"/>
+      </w:pPr>
+      <w:r>
+        <w:rPr>
+          <w:rFonts w:ascii="Consolas" w:eastAsia="Consolas" w:hAnsi="Consolas" w:cs="Consolas"/>
+          <w:sz w:val="13"/>
+          <w:szCs w:val="13"/>
+        </w:rPr>
+        <w:t>[00:55:57.709] set 14 blocked: circuit open, 3.0s until a trial call</w:t>
+      </w:r>
+    </w:p>
+    <w:p>
+      <w:pPr>
+        <w:shd w:val="clear" w:color="auto" w:fill="F2F2F2"/>
+        <w:spacing w:line="250" w:lineRule="auto"/>
+        <w:ind w:left="120" w:right="120"/>
+      </w:pPr>
+      <w:r>
+        <w:rPr>
+          <w:rFonts w:ascii="Consolas" w:eastAsia="Consolas" w:hAnsi="Consolas" w:cs="Consolas"/>
+          <w:sz w:val="13"/>
+          <w:szCs w:val="13"/>
+        </w:rPr>
+        <w:t>[00:55:58.709] set 15 blocked: circuit open, 2.0s until a trial call</w:t>
+      </w:r>
+    </w:p>
+    <w:p>
+      <w:pPr>
+        <w:shd w:val="clear" w:color="auto" w:fill="F2F2F2"/>
+        <w:spacing w:line="250" w:lineRule="auto"/>
+        <w:ind w:left="120" w:right="120"/>
+      </w:pPr>
+      <w:r>
+        <w:rPr>
+          <w:rFonts w:ascii="Consolas" w:eastAsia="Consolas" w:hAnsi="Consolas" w:cs="Consolas"/>
+          <w:sz w:val="13"/>
+          <w:szCs w:val="13"/>
+        </w:rPr>
+        <w:t>[00:55:59.709] set 16 blocked: circuit open, 1.0s until a trial call</w:t>
+      </w:r>
+    </w:p>
+    <w:p>
+      <w:pPr>
+        <w:shd w:val="clear" w:color="auto" w:fill="F2F2F2"/>
+        <w:spacing w:line="250" w:lineRule="auto"/>
+        <w:ind w:left="120" w:right="120"/>
+      </w:pPr>
+      <w:r>
+        <w:rPr>
+          <w:rFonts w:ascii="Consolas" w:eastAsia="Consolas" w:hAnsi="Consolas" w:cs="Consolas"/>
+          <w:sz w:val="13"/>
+          <w:szCs w:val="13"/>
+        </w:rPr>
+        <w:t>[00:56:00.710] breaker HALF_OPEN: letting one trial call through</w:t>
+      </w:r>
+    </w:p>
+    <w:p>
+      <w:pPr>
+        <w:shd w:val="clear" w:color="auto" w:fill="F2F2F2"/>
+        <w:spacing w:line="250" w:lineRule="auto"/>
+        <w:ind w:left="120" w:right="120"/>
+      </w:pPr>
+      <w:r>
+        <w:rPr>
+          <w:rFonts w:ascii="Consolas" w:eastAsia="Consolas" w:hAnsi="Consolas" w:cs="Consolas"/>
+          <w:sz w:val="13"/>
+          <w:szCs w:val="13"/>
+        </w:rPr>
+        <w:t>[00:56:00.891] breaker CLOSED: trial call succeeded, normal service resumed</w:t>
+      </w:r>
+    </w:p>
+    <w:p>
+      <w:pPr>
+        <w:shd w:val="clear" w:color="auto" w:fill="F2F2F2"/>
+        <w:spacing w:line="250" w:lineRule="auto"/>
+        <w:ind w:left="120" w:right="120"/>
+      </w:pPr>
+      <w:r>
+        <w:rPr>
+          <w:rFonts w:ascii="Consolas" w:eastAsia="Consolas" w:hAnsi="Consolas" w:cs="Consolas"/>
+          <w:sz w:val="13"/>
+          <w:szCs w:val="13"/>
+        </w:rPr>
+        <w:t>[00:56:00.891] set 17 attempt 1 -&gt; 201 (181 ms, request id ddf808658c8e49ff)</w:t>
+      </w:r>
+    </w:p>
+    <w:p>
+      <w:pPr>
+        <w:shd w:val="clear" w:color="auto" w:fill="F2F2F2"/>
+        <w:spacing w:line="250" w:lineRule="auto"/>
+        <w:ind w:left="120" w:right="120"/>
+      </w:pPr>
+      <w:r>
+        <w:rPr>
+          <w:rFonts w:ascii="Consolas" w:eastAsia="Consolas" w:hAnsi="Consolas" w:cs="Consolas"/>
+          <w:sz w:val="13"/>
+          <w:szCs w:val="13"/>
+        </w:rPr>
+        <w:t>[00:56:00.891] set 17 written: log_id 93, 102.5 × 8</w:t>
+      </w:r>
+    </w:p>
+    <w:p>
+      <w:pPr>
+        <w:shd w:val="clear" w:color="auto" w:fill="F2F2F2"/>
+        <w:spacing w:line="250" w:lineRule="auto"/>
+        <w:ind w:left="120" w:right="120"/>
+      </w:pPr>
+      <w:r>
+        <w:rPr>
+          <w:rFonts w:ascii="Consolas" w:eastAsia="Consolas" w:hAnsi="Consolas" w:cs="Consolas"/>
+          <w:sz w:val="13"/>
+          <w:szCs w:val="13"/>
+        </w:rPr>
+        <w:t>[00:56:01.975] set 18 attempt 1 -&gt; 201 (84 ms, request id d88def3fb6c8421e)</w:t>
+      </w:r>
+    </w:p>
+    <w:p>
+      <w:pPr>
+        <w:shd w:val="clear" w:color="auto" w:fill="F2F2F2"/>
+        <w:spacing w:line="250" w:lineRule="auto"/>
+        <w:ind w:left="120" w:right="120"/>
+      </w:pPr>
+      <w:r>
+        <w:rPr>
+          <w:rFonts w:ascii="Consolas" w:eastAsia="Consolas" w:hAnsi="Consolas" w:cs="Consolas"/>
+          <w:sz w:val="13"/>
+          <w:szCs w:val="13"/>
+        </w:rPr>
+        <w:t>[00:56:01.975] set 18 written: log_id 94, 105 × 8</w:t>
+      </w:r>
+    </w:p>
+    <w:p>
+      <w:pPr>
+        <w:shd w:val="clear" w:color="auto" w:fill="F2F2F2"/>
+        <w:spacing w:line="250" w:lineRule="auto"/>
+        <w:ind w:left="120" w:right="120"/>
+      </w:pPr>
+      <w:r>
+        <w:rPr>
+          <w:rFonts w:ascii="Consolas" w:eastAsia="Consolas" w:hAnsi="Consolas" w:cs="Consolas"/>
+          <w:sz w:val="13"/>
+          <w:szCs w:val="13"/>
+        </w:rPr>
+        <w:t>[00:56:03.059] set 19 attempt 1 -&gt; 201 (83 ms, request id 641c4badb23e4098)</w:t>
+      </w:r>
+    </w:p>
+    <w:p>
+      <w:pPr>
+        <w:shd w:val="clear" w:color="auto" w:fill="F2F2F2"/>
+        <w:spacing w:line="250" w:lineRule="auto"/>
+        <w:ind w:left="120" w:right="120"/>
+      </w:pPr>
+      <w:r>
+        <w:rPr>
+          <w:rFonts w:ascii="Consolas" w:eastAsia="Consolas" w:hAnsi="Consolas" w:cs="Consolas"/>
+          <w:sz w:val="13"/>
+          <w:szCs w:val="13"/>
+        </w:rPr>
+        <w:t>[00:56:03.059] set 19 written: log_id 95, 107.5 × 8</w:t>
+      </w:r>
+    </w:p>
+    <w:p>
+      <w:pPr>
+        <w:shd w:val="clear" w:color="auto" w:fill="F2F2F2"/>
+        <w:spacing w:line="250" w:lineRule="auto"/>
+        <w:ind w:left="120" w:right="120"/>
+      </w:pPr>
+      <w:r>
+        <w:rPr>
+          <w:rFonts w:ascii="Consolas" w:eastAsia="Consolas" w:hAnsi="Consolas" w:cs="Consolas"/>
+          <w:sz w:val="13"/>
+          <w:szCs w:val="13"/>
+        </w:rPr>
+        <w:t>[00:56:06.074] set 20 attempt 1 -&gt; timed out after 2.0s; retrying in 0.58s</w:t>
+      </w:r>
+    </w:p>
+    <w:p>
+      <w:pPr>
+        <w:shd w:val="clear" w:color="auto" w:fill="F2F2F2"/>
+        <w:spacing w:line="250" w:lineRule="auto"/>
+        <w:ind w:left="120" w:right="120"/>
+      </w:pPr>
+      <w:r>
+        <w:rPr>
+          <w:rFonts w:ascii="Consolas" w:eastAsia="Consolas" w:hAnsi="Consolas" w:cs="Consolas"/>
+          <w:sz w:val="13"/>
+          <w:szCs w:val="13"/>
+        </w:rPr>
+        <w:t>[00:56:06.768] set 20 attempt 2 -&gt; 201 (110 ms, request id 9f522282a7044194)</w:t>
+      </w:r>
+    </w:p>
+    <w:p>
+      <w:pPr>
+        <w:shd w:val="clear" w:color="auto" w:fill="F2F2F2"/>
+        <w:spacing w:line="250" w:lineRule="auto"/>
+        <w:ind w:left="120" w:right="120"/>
+      </w:pPr>
+      <w:r>
+        <w:rPr>
+          <w:rFonts w:ascii="Consolas" w:eastAsia="Consolas" w:hAnsi="Consolas" w:cs="Consolas"/>
+          <w:sz w:val="13"/>
+          <w:szCs w:val="13"/>
+        </w:rPr>
+        <w:t>[00:56:06.768] set 20 written: log_id 96, 110 × 8</w:t>
+      </w:r>
+    </w:p>
+    <w:p>
+      <w:pPr>
+        <w:shd w:val="clear" w:color="auto" w:fill="F2F2F2"/>
+        <w:spacing w:line="250" w:lineRule="auto"/>
+        <w:ind w:left="120" w:right="120"/>
+      </w:pPr>
+      <w:r>
+        <w:rPr>
+          <w:rFonts w:ascii="Consolas" w:eastAsia="Consolas" w:hAnsi="Consolas" w:cs="Consolas"/>
+          <w:sz w:val="13"/>
+          <w:szCs w:val="13"/>
+        </w:rPr>
+        <w:t>[00:56:07.860] set 21 attempt 1 -&gt; 201 (91 ms, request id 1a2619e1a12e42d8)</w:t>
+      </w:r>
+    </w:p>
+    <w:p>
+      <w:pPr>
+        <w:shd w:val="clear" w:color="auto" w:fill="F2F2F2"/>
+        <w:spacing w:line="250" w:lineRule="auto"/>
+        <w:ind w:left="120" w:right="120"/>
+      </w:pPr>
+      <w:r>
+        <w:rPr>
+          <w:rFonts w:ascii="Consolas" w:eastAsia="Consolas" w:hAnsi="Consolas" w:cs="Consolas"/>
+          <w:sz w:val="13"/>
+          <w:szCs w:val="13"/>
+        </w:rPr>
+        <w:t>[00:56:07.860] set 21 written: log_id 97, 112.5 × 8</w:t>
+      </w:r>
+    </w:p>
+    <w:p>
+      <w:pPr>
+        <w:shd w:val="clear" w:color="auto" w:fill="F2F2F2"/>
+        <w:spacing w:line="250" w:lineRule="auto"/>
+        <w:ind w:left="120" w:right="120"/>
+      </w:pPr>
+      <w:r>
+        <w:rPr>
+          <w:rFonts w:ascii="Consolas" w:eastAsia="Consolas" w:hAnsi="Consolas" w:cs="Consolas"/>
+          <w:sz w:val="13"/>
+          <w:szCs w:val="13"/>
+        </w:rPr>
+        <w:t>[00:56:08.975] set 22 attempt 1 -&gt; 201 (114 ms, request id 12eff2adfcb14049)</w:t>
+      </w:r>
+    </w:p>
+    <w:p>
+      <w:pPr>
+        <w:shd w:val="clear" w:color="auto" w:fill="F2F2F2"/>
+        <w:spacing w:line="250" w:lineRule="auto"/>
+        <w:ind w:left="120" w:right="120"/>
+      </w:pPr>
+      <w:r>
+        <w:rPr>
+          <w:rFonts w:ascii="Consolas" w:eastAsia="Consolas" w:hAnsi="Consolas" w:cs="Consolas"/>
+          <w:sz w:val="13"/>
+          <w:szCs w:val="13"/>
+        </w:rPr>
+        <w:t>[00:56:08.975] set 22 written: log_id 98, 115 × 8</w:t>
+      </w:r>
+    </w:p>
+    <w:p>
+      <w:pPr>
+        <w:shd w:val="clear" w:color="auto" w:fill="F2F2F2"/>
+        <w:spacing w:line="250" w:lineRule="auto"/>
+        <w:ind w:left="120" w:right="120"/>
+      </w:pPr>
+      <w:r>
+        <w:rPr>
+          <w:rFonts w:ascii="Consolas" w:eastAsia="Consolas" w:hAnsi="Consolas" w:cs="Consolas"/>
+          <w:sz w:val="13"/>
+          <w:szCs w:val="13"/>
+        </w:rPr>
+        <w:t>[00:56:11.992] set 23 attempt 1 -&gt; timed out after 2.0s; retrying in 0.60s</w:t>
+      </w:r>
+    </w:p>
+    <w:p>
+      <w:pPr>
+        <w:shd w:val="clear" w:color="auto" w:fill="F2F2F2"/>
+        <w:spacing w:line="250" w:lineRule="auto"/>
+        <w:ind w:left="120" w:right="120"/>
+      </w:pPr>
+      <w:r>
+        <w:rPr>
+          <w:rFonts w:ascii="Consolas" w:eastAsia="Consolas" w:hAnsi="Consolas" w:cs="Consolas"/>
+          <w:sz w:val="13"/>
+          <w:szCs w:val="13"/>
+        </w:rPr>
+        <w:t>[00:56:12.701] set 23 attempt 2 -&gt; 201 (111 ms, request id 28b419b6ec3344e7)</w:t>
+      </w:r>
+    </w:p>
+    <w:p>
+      <w:pPr>
+        <w:shd w:val="clear" w:color="auto" w:fill="F2F2F2"/>
+        <w:spacing w:line="250" w:lineRule="auto"/>
+        <w:ind w:left="120" w:right="120"/>
+      </w:pPr>
+      <w:r>
+        <w:rPr>
+          <w:rFonts w:ascii="Consolas" w:eastAsia="Consolas" w:hAnsi="Consolas" w:cs="Consolas"/>
+          <w:sz w:val="13"/>
+          <w:szCs w:val="13"/>
+        </w:rPr>
+        <w:t>[00:56:12.701] set 23 written: log_id 99, 117.5 × 8</w:t>
+      </w:r>
+    </w:p>
+    <w:p>
+      <w:pPr>
+        <w:shd w:val="clear" w:color="auto" w:fill="F2F2F2"/>
+        <w:spacing w:line="250" w:lineRule="auto"/>
+        <w:ind w:left="120" w:right="120"/>
+      </w:pPr>
+      <w:r>
+        <w:rPr>
+          <w:rFonts w:ascii="Consolas" w:eastAsia="Consolas" w:hAnsi="Consolas" w:cs="Consolas"/>
+          <w:sz w:val="13"/>
+          <w:szCs w:val="13"/>
+        </w:rPr>
+        <w:t>[00:56:13.782] set 24 attempt 1 -&gt; 201 (81 ms, request id f535baf2f3834b5f)</w:t>
+      </w:r>
+    </w:p>
+    <w:p>
+      <w:pPr>
+        <w:shd w:val="clear" w:color="auto" w:fill="F2F2F2"/>
+        <w:spacing w:line="250" w:lineRule="auto"/>
+        <w:ind w:left="120" w:right="120"/>
+      </w:pPr>
+      <w:r>
+        <w:rPr>
+          <w:rFonts w:ascii="Consolas" w:eastAsia="Consolas" w:hAnsi="Consolas" w:cs="Consolas"/>
+          <w:sz w:val="13"/>
+          <w:szCs w:val="13"/>
+        </w:rPr>
+        <w:t>[00:56:13.782] set 24 written: log_id 100, 120 × 8</w:t>
+      </w:r>
+    </w:p>
+    <w:p>
+      <w:pPr>
+        <w:shd w:val="clear" w:color="auto" w:fill="F2F2F2"/>
+        <w:spacing w:line="250" w:lineRule="auto"/>
+        <w:ind w:left="120" w:right="120"/>
+      </w:pPr>
+      <w:r>
+        <w:rPr>
+          <w:rFonts w:ascii="Consolas" w:eastAsia="Consolas" w:hAnsi="Consolas" w:cs="Consolas"/>
+          <w:sz w:val="13"/>
+          <w:szCs w:val="13"/>
+        </w:rPr>
+        <w:t>[00:56:14.871] set 25 attempt 1 -&gt; 201 (88 ms, request id d34a9e579d3b4f6a)</w:t>
+      </w:r>
+    </w:p>
+    <w:p>
+      <w:pPr>
+        <w:shd w:val="clear" w:color="auto" w:fill="F2F2F2"/>
+        <w:spacing w:line="250" w:lineRule="auto"/>
+        <w:ind w:left="120" w:right="120"/>
+      </w:pPr>
+      <w:r>
+        <w:rPr>
+          <w:rFonts w:ascii="Consolas" w:eastAsia="Consolas" w:hAnsi="Consolas" w:cs="Consolas"/>
+          <w:sz w:val="13"/>
+          <w:szCs w:val="13"/>
+        </w:rPr>
+        <w:t>[00:56:14.871] set 25 written: log_id 101, 122.5 × 8</w:t>
+      </w:r>
+    </w:p>
+    <w:p>
+      <w:pPr>
+        <w:shd w:val="clear" w:color="auto" w:fill="F2F2F2"/>
+        <w:spacing w:line="250" w:lineRule="auto"/>
+        <w:ind w:left="120" w:right="120"/>
+      </w:pPr>
+      <w:r>
+        <w:rPr>
+          <w:rFonts w:ascii="Consolas" w:eastAsia="Consolas" w:hAnsi="Consolas" w:cs="Consolas"/>
+          <w:sz w:val="13"/>
+          <w:szCs w:val="13"/>
+        </w:rPr>
+        <w:t>[00:56:17.875] set 26 attempt 1 -&gt; timed out after 2.0s; retrying in 0.55s</w:t>
+      </w:r>
+    </w:p>
+    <w:p>
+      <w:pPr>
+        <w:shd w:val="clear" w:color="auto" w:fill="F2F2F2"/>
+        <w:spacing w:line="250" w:lineRule="auto"/>
+        <w:ind w:left="120" w:right="120"/>
+      </w:pPr>
+      <w:r>
+        <w:rPr>
+          <w:rFonts w:ascii="Consolas" w:eastAsia="Consolas" w:hAnsi="Consolas" w:cs="Consolas"/>
+          <w:sz w:val="13"/>
+          <w:szCs w:val="13"/>
+        </w:rPr>
+        <w:t>[00:56:20.441] set 26 attempt 2 -&gt; timed out after 2.0s; retrying in 1.13s</w:t>
+      </w:r>
+    </w:p>
+    <w:p>
+      <w:pPr>
+        <w:shd w:val="clear" w:color="auto" w:fill="F2F2F2"/>
+        <w:spacing w:line="250" w:lineRule="auto"/>
+        <w:ind w:left="120" w:right="120"/>
+      </w:pPr>
+      <w:r>
+        <w:rPr>
+          <w:rFonts w:ascii="Consolas" w:eastAsia="Consolas" w:hAnsi="Consolas" w:cs="Consolas"/>
+          <w:sz w:val="13"/>
+          <w:szCs w:val="13"/>
+        </w:rPr>
+        <w:t>[00:56:23.573] breaker OPEN after 3 consecutive failure(s): blocking calls for 10s</w:t>
+      </w:r>
+    </w:p>
+    <w:p>
+      <w:pPr>
+        <w:shd w:val="clear" w:color="auto" w:fill="F2F2F2"/>
+        <w:spacing w:line="250" w:lineRule="auto"/>
+        <w:ind w:left="120" w:right="120"/>
+      </w:pPr>
+      <w:r>
+        <w:rPr>
+          <w:rFonts w:ascii="Consolas" w:eastAsia="Consolas" w:hAnsi="Consolas" w:cs="Consolas"/>
+          <w:sz w:val="13"/>
+          <w:szCs w:val="13"/>
+        </w:rPr>
+        <w:t>[00:56:23.573] set 26 attempt 3 -&gt; timed out after 2.0s; no retries left</w:t>
+      </w:r>
+    </w:p>
+    <w:p>
+      <w:pPr>
+        <w:shd w:val="clear" w:color="auto" w:fill="F2F2F2"/>
+        <w:spacing w:line="250" w:lineRule="auto"/>
+        <w:ind w:left="120" w:right="120"/>
+      </w:pPr>
+      <w:r>
+        <w:rPr>
+          <w:rFonts w:ascii="Consolas" w:eastAsia="Consolas" w:hAnsi="Consolas" w:cs="Consolas"/>
+          <w:sz w:val="13"/>
+          <w:szCs w:val="13"/>
+        </w:rPr>
+        <w:t>[00:56:23.573] set 26 failed: timed out after 2.0s</w:t>
+      </w:r>
+    </w:p>
+    <w:p>
+      <w:pPr>
+        <w:shd w:val="clear" w:color="auto" w:fill="F2F2F2"/>
+        <w:spacing w:line="250" w:lineRule="auto"/>
+        <w:ind w:left="120" w:right="120"/>
+      </w:pPr>
+      <w:r>
+        <w:rPr>
+          <w:rFonts w:ascii="Consolas" w:eastAsia="Consolas" w:hAnsi="Consolas" w:cs="Consolas"/>
+          <w:sz w:val="13"/>
+          <w:szCs w:val="13"/>
+        </w:rPr>
+        <w:t>[00:56:24.574] set 27 blocked: circuit open, 9.0s until a trial call</w:t>
+      </w:r>
+    </w:p>
+    <w:p>
+      <w:pPr>
+        <w:shd w:val="clear" w:color="auto" w:fill="F2F2F2"/>
+        <w:spacing w:line="250" w:lineRule="auto"/>
+        <w:ind w:left="120" w:right="120"/>
+      </w:pPr>
+      <w:r>
+        <w:rPr>
+          <w:rFonts w:ascii="Consolas" w:eastAsia="Consolas" w:hAnsi="Consolas" w:cs="Consolas"/>
+          <w:sz w:val="13"/>
+          <w:szCs w:val="13"/>
+        </w:rPr>
+        <w:t>[00:56:25.574] set 28 blocked: circuit open, 8.0s until a trial call</w:t>
+      </w:r>
+    </w:p>
+    <w:p>
+      <w:pPr>
+        <w:shd w:val="clear" w:color="auto" w:fill="F2F2F2"/>
+        <w:spacing w:line="250" w:lineRule="auto"/>
+        <w:ind w:left="120" w:right="120"/>
+      </w:pPr>
+      <w:r>
+        <w:rPr>
+          <w:rFonts w:ascii="Consolas" w:eastAsia="Consolas" w:hAnsi="Consolas" w:cs="Consolas"/>
+          <w:sz w:val="13"/>
+          <w:szCs w:val="13"/>
+        </w:rPr>
+        <w:t>[00:56:26.575] set 29 blocked: circuit open, 7.0s until a trial call</w:t>
+      </w:r>
+    </w:p>
+    <w:p>
+      <w:pPr>
+        <w:shd w:val="clear" w:color="auto" w:fill="F2F2F2"/>
+        <w:spacing w:line="250" w:lineRule="auto"/>
+        <w:ind w:left="120" w:right="120"/>
+      </w:pPr>
+      <w:r>
+        <w:rPr>
+          <w:rFonts w:ascii="Consolas" w:eastAsia="Consolas" w:hAnsi="Consolas" w:cs="Consolas"/>
+          <w:sz w:val="13"/>
+          <w:szCs w:val="13"/>
+        </w:rPr>
+        <w:t>[00:56:27.575] set 30 blocked: circuit open, 6.0s until a trial call</w:t>
+      </w:r>
+    </w:p>
+    <w:p>
+      <w:pPr>
+        <w:shd w:val="clear" w:color="auto" w:fill="F2F2F2"/>
+        <w:spacing w:after="160" w:line="250" w:lineRule="auto"/>
+        <w:ind w:left="120" w:right="120"/>
+      </w:pPr>
+      <w:r>
+        <w:rPr>
+          <w:rFonts w:ascii="Consolas" w:eastAsia="Consolas" w:hAnsi="Consolas" w:cs="Consolas"/>
+          <w:sz w:val="13"/>
+          <w:szCs w:val="13"/>
+        </w:rPr>
+        <w:t>[00:56:27.575] summary: written 15, replayed 0, blocked 13, failed 2, refused 0</w:t>
+      </w:r>
+    </w:p>
+    <w:p>
+      <w:pPr>
         <w:keepNext/>
-      </w:pPr>
-      <w:bookmarkStart w:id="9" w:name="_Toc243521917"/>
-      <w:r>
-        <w:t>B.1 The operation and where it runs</w:t>
-      </w:r>
-      <w:bookmarkEnd w:id="9"/>
-    </w:p>
-    <w:p>
-      <w:pPr>
         <w:spacing w:after="120"/>
       </w:pPr>
-      <w:r>
-        <w:t xml:space="preserve">The operation taken from the user task is </w:t>
-      </w:r>
       <w:r>
         <w:rPr>
           <w:b/>
           <w:bCs/>
         </w:rPr>
-        <w:t>logging a set</w:t>
-      </w:r>
-      <w:r>
-        <w:t xml:space="preserve">: </w:t>
-      </w:r>
-      <w:r>
-        <w:rPr>
-          <w:rFonts w:ascii="Consolas" w:eastAsia="Consolas" w:hAnsi="Consolas" w:cs="Consolas"/>
-          <w:sz w:val="19"/>
-          <w:szCs w:val="19"/>
-        </w:rPr>
-        <w:t>WorkoutService.LogSet</w:t>
-      </w:r>
-      <w:r>
-        <w:t>, a unary RPC (one set in, one result out: nothing to stream).</w:t>
+        <w:t>What the run shows:</w:t>
       </w:r>
     </w:p>
     <w:p>
@@ -7444,54 +8490,10 @@
           <w:b/>
           <w:bCs/>
         </w:rPr>
-        <w:t>Its own process and container.</w:t>
-      </w:r>
-      <w:r>
-        <w:t xml:space="preserve"> </w:t>
-      </w:r>
-      <w:r>
-        <w:rPr>
-          <w:rFonts w:ascii="Consolas" w:eastAsia="Consolas" w:hAnsi="Consolas" w:cs="Consolas"/>
-          <w:sz w:val="19"/>
-          <w:szCs w:val="19"/>
-        </w:rPr>
-        <w:t>grpc_server.py</w:t>
-      </w:r>
-      <w:r>
-        <w:t xml:space="preserve"> runs as the </w:t>
-      </w:r>
-      <w:r>
-        <w:rPr>
-          <w:rFonts w:ascii="Consolas" w:eastAsia="Consolas" w:hAnsi="Consolas" w:cs="Consolas"/>
-          <w:sz w:val="19"/>
-          <w:szCs w:val="19"/>
-        </w:rPr>
-        <w:t>gym-grpc</w:t>
-      </w:r>
-      <w:r>
-        <w:t xml:space="preserve"> service in </w:t>
-      </w:r>
-      <w:r>
-        <w:rPr>
-          <w:rFonts w:ascii="Consolas" w:eastAsia="Consolas" w:hAnsi="Consolas" w:cs="Consolas"/>
-          <w:sz w:val="19"/>
-          <w:szCs w:val="19"/>
-        </w:rPr>
-        <w:t>docker-compose.yml</w:t>
-      </w:r>
-      <w:r>
-        <w:t xml:space="preserve">, on port 50051, with Prometheus metrics on 9102. The HTTP version stays in the </w:t>
-      </w:r>
-      <w:r>
-        <w:rPr>
-          <w:rFonts w:ascii="Consolas" w:eastAsia="Consolas" w:hAnsi="Consolas" w:cs="Consolas"/>
-          <w:sz w:val="19"/>
-          <w:szCs w:val="19"/>
-        </w:rPr>
-        <w:t>gym-tracker</w:t>
-      </w:r>
-      <w:r>
-        <w:t xml:space="preserve"> app container.</w:t>
+        <w:t>Success:</w:t>
+      </w:r>
+      <w:r>
+        <w:t xml:space="preserve"> sets 1–6 and 17–25 are all written (201, about 80–110 ms), all but 4, 20 and 23 on the first attempt.</w:t>
       </w:r>
     </w:p>
     <w:p>
@@ -7508,43 +8510,10 @@
           <w:b/>
           <w:bCs/>
         </w:rPr>
-        <w:t>Same business rules, same source of truth.</w:t>
-      </w:r>
-      <w:r>
-        <w:t xml:space="preserve"> Both the HTTP handler (</w:t>
-      </w:r>
-      <w:r>
-        <w:rPr>
-          <w:rFonts w:ascii="Consolas" w:eastAsia="Consolas" w:hAnsi="Consolas" w:cs="Consolas"/>
-          <w:sz w:val="19"/>
-          <w:szCs w:val="19"/>
-        </w:rPr>
-        <w:t>api.log_set</w:t>
-      </w:r>
-      <w:r>
-        <w:t>) and the gRPC handler (</w:t>
-      </w:r>
-      <w:r>
-        <w:rPr>
-          <w:rFonts w:ascii="Consolas" w:eastAsia="Consolas" w:hAnsi="Consolas" w:cs="Consolas"/>
-          <w:sz w:val="19"/>
-          <w:szCs w:val="19"/>
-        </w:rPr>
-        <w:t>WorkoutService._log_set</w:t>
-      </w:r>
-      <w:r>
-        <w:t xml:space="preserve">) call </w:t>
-      </w:r>
-      <w:r>
-        <w:rPr>
-          <w:rFonts w:ascii="Consolas" w:eastAsia="Consolas" w:hAnsi="Consolas" w:cs="Consolas"/>
-          <w:sz w:val="19"/>
-          <w:szCs w:val="19"/>
-        </w:rPr>
-        <w:t>sessions.log_set</w:t>
-      </w:r>
-      <w:r>
-        <w:t xml:space="preserve"> with a connection to the same Postgres database. Validation, ownership checks, record detection and idempotency are one piece of code reached two ways. The gRPC server never calls the HTTP API.</w:t>
+        <w:t>Retrying a failure:</w:t>
+      </w:r>
+      <w:r>
+        <w:t xml:space="preserve"> sets 4, 20 and 23 hit the injected 3 s delay, time out at 2 s, and succeed on the retry 0.5–0.6 s later.</w:t>
       </w:r>
     </w:p>
     <w:p>
@@ -7561,10 +8530,80 @@
           <w:b/>
           <w:bCs/>
         </w:rPr>
-        <w:t>Same accounts.</w:t>
-      </w:r>
-      <w:r>
-        <w:t xml:space="preserve"> Credentials go in the </w:t>
+        <w:t>Breaker open, calls blocked:</w:t>
+      </w:r>
+      <w:r>
+        <w:t xml:space="preserve"> with the container stopped, set 7 fails three attempts in a row (connection aborted, then two timeouts), the breaker opens, and sets 8–16 are blocked immediately without a request, counting down to the trial call.</w:t>
+      </w:r>
+    </w:p>
+    <w:p>
+      <w:pPr>
+        <w:pStyle w:val="ListParagraph"/>
+        <w:numPr>
+          <w:ilvl w:val="0"/>
+          <w:numId w:val="2"/>
+        </w:numPr>
+        <w:spacing w:after="60"/>
+      </w:pPr>
+      <w:r>
+        <w:rPr>
+          <w:b/>
+          <w:bCs/>
+        </w:rPr>
+        <w:t>Recovery:</w:t>
+      </w:r>
+      <w:r>
+        <w:t xml:space="preserve"> 10 s later the breaker goes HALF_OPEN, the trial call (set 17) returns 201, and it closes. Normal service resumes.</w:t>
+      </w:r>
+    </w:p>
+    <w:p>
+      <w:pPr>
+        <w:pStyle w:val="ListParagraph"/>
+        <w:numPr>
+          <w:ilvl w:val="0"/>
+          <w:numId w:val="2"/>
+        </w:numPr>
+        <w:spacing w:after="60"/>
+      </w:pPr>
+      <w:r>
+        <w:rPr>
+          <w:b/>
+          <w:bCs/>
+        </w:rPr>
+        <w:t>A second opening, from a slow server rather than a dead one:</w:t>
+      </w:r>
+      <w:r>
+        <w:t xml:space="preserve"> set 26's first attempt was delayed by the fault, and its two retries also took longer than 2 s. The server logs show both retries arriving late and being handled about 6 s later: one wrote the set (201) and the other was answered as a replay (200). So the set was written once even though the caller reported it as failed. The run ended while the breaker was still open. The cause of that 6 s server-side delay was not investigated further.</w:t>
+      </w:r>
+    </w:p>
+    <w:p>
+      <w:pPr>
+        <w:spacing w:after="120"/>
+      </w:pPr>
+      <w:r>
+        <w:rPr>
+          <w:b/>
+          <w:bCs/>
+        </w:rPr>
+        <w:t>No duplicates.</w:t>
+      </w:r>
+      <w:r>
+        <w:t xml:space="preserve"> After the run, workout 2 held 16 rows with 16 distinct Idempotency-Keys: the 15 sets the caller saw written, plus set 26, which the server wrote once. The retries did not duplicate any set.</w:t>
+      </w:r>
+    </w:p>
+    <w:p>
+      <w:pPr>
+        <w:spacing w:after="120"/>
+      </w:pPr>
+      <w:r>
+        <w:rPr>
+          <w:b/>
+          <w:bCs/>
+        </w:rPr>
+        <w:t>Two fixes to the demo script were needed on Windows</w:t>
+      </w:r>
+      <w:r>
+        <w:t xml:space="preserve">, both in </w:t>
       </w:r>
       <w:r>
         <w:rPr>
@@ -7572,10 +8611,10 @@
           <w:sz w:val="19"/>
           <w:szCs w:val="19"/>
         </w:rPr>
-        <w:t>authorization</w:t>
-      </w:r>
-      <w:r>
-        <w:t xml:space="preserve"> metadata as HTTP Basic and are checked with </w:t>
+        <w:t>scripts/demo_reliability.sh</w:t>
+      </w:r>
+      <w:r>
+        <w:t xml:space="preserve">. Git Bash rewrote </w:t>
       </w:r>
       <w:r>
         <w:rPr>
@@ -7583,18 +8622,254 @@
           <w:sz w:val="19"/>
           <w:szCs w:val="19"/>
         </w:rPr>
-        <w:t>auth.authenticate</w:t>
-      </w:r>
-      <w:r>
-        <w:t xml:space="preserve"> against the same accounts table.</w:t>
-      </w:r>
+        <w:t>FAULT_PATH_PREFIX=/api/sessions/</w:t>
+      </w:r>
+      <w:r>
+        <w:t xml:space="preserve"> into a Windows path before it reached </w:t>
+      </w:r>
+      <w:r>
+        <w:rPr>
+          <w:rFonts w:ascii="Consolas" w:eastAsia="Consolas" w:hAnsi="Consolas" w:cs="Consolas"/>
+          <w:sz w:val="19"/>
+          <w:szCs w:val="19"/>
+        </w:rPr>
+        <w:t>docker.exe</w:t>
+      </w:r>
+      <w:r>
+        <w:t xml:space="preserve">, so no fault fired; </w:t>
+      </w:r>
+      <w:r>
+        <w:rPr>
+          <w:rFonts w:ascii="Consolas" w:eastAsia="Consolas" w:hAnsi="Consolas" w:cs="Consolas"/>
+          <w:sz w:val="19"/>
+          <w:szCs w:val="19"/>
+        </w:rPr>
+        <w:t>MSYS2_ENV_CONV_EXCL</w:t>
+      </w:r>
+      <w:r>
+        <w:t xml:space="preserve"> now stops that. The run was also lengthened from 18 to 30 calls, so it outlasts the outage and the recovery period.</w:t>
+      </w:r>
+    </w:p>
+    <w:p>
+      <w:r>
+        <w:br w:type="page"/>
+      </w:r>
+    </w:p>
+    <w:p>
+      <w:pPr>
+        <w:pStyle w:val="Heading1"/>
+      </w:pPr>
+      <w:bookmarkStart w:id="8" w:name="_Toc243523452"/>
+      <w:r>
+        <w:t>Part B: The gRPC service</w:t>
+      </w:r>
+      <w:bookmarkEnd w:id="8"/>
     </w:p>
     <w:p>
       <w:pPr>
         <w:pStyle w:val="Heading2"/>
         <w:keepNext/>
       </w:pPr>
-      <w:bookmarkStart w:id="10" w:name="_Toc243521918"/>
+      <w:bookmarkStart w:id="9" w:name="_Toc243523453"/>
+      <w:r>
+        <w:t>B.1 The operation and where it runs</w:t>
+      </w:r>
+      <w:bookmarkEnd w:id="9"/>
+    </w:p>
+    <w:p>
+      <w:pPr>
+        <w:spacing w:after="120"/>
+      </w:pPr>
+      <w:r>
+        <w:t xml:space="preserve">The operation taken from the user task is </w:t>
+      </w:r>
+      <w:r>
+        <w:rPr>
+          <w:b/>
+          <w:bCs/>
+        </w:rPr>
+        <w:t>logging a set</w:t>
+      </w:r>
+      <w:r>
+        <w:t xml:space="preserve">: </w:t>
+      </w:r>
+      <w:r>
+        <w:rPr>
+          <w:rFonts w:ascii="Consolas" w:eastAsia="Consolas" w:hAnsi="Consolas" w:cs="Consolas"/>
+          <w:sz w:val="19"/>
+          <w:szCs w:val="19"/>
+        </w:rPr>
+        <w:t>WorkoutService.LogSet</w:t>
+      </w:r>
+      <w:r>
+        <w:t>, a unary RPC (one set in, one result out: nothing to stream).</w:t>
+      </w:r>
+    </w:p>
+    <w:p>
+      <w:pPr>
+        <w:pStyle w:val="ListParagraph"/>
+        <w:numPr>
+          <w:ilvl w:val="0"/>
+          <w:numId w:val="2"/>
+        </w:numPr>
+        <w:spacing w:after="60"/>
+      </w:pPr>
+      <w:r>
+        <w:rPr>
+          <w:b/>
+          <w:bCs/>
+        </w:rPr>
+        <w:t>Its own process and container.</w:t>
+      </w:r>
+      <w:r>
+        <w:t xml:space="preserve"> </w:t>
+      </w:r>
+      <w:r>
+        <w:rPr>
+          <w:rFonts w:ascii="Consolas" w:eastAsia="Consolas" w:hAnsi="Consolas" w:cs="Consolas"/>
+          <w:sz w:val="19"/>
+          <w:szCs w:val="19"/>
+        </w:rPr>
+        <w:t>grpc_server.py</w:t>
+      </w:r>
+      <w:r>
+        <w:t xml:space="preserve"> runs as the </w:t>
+      </w:r>
+      <w:r>
+        <w:rPr>
+          <w:rFonts w:ascii="Consolas" w:eastAsia="Consolas" w:hAnsi="Consolas" w:cs="Consolas"/>
+          <w:sz w:val="19"/>
+          <w:szCs w:val="19"/>
+        </w:rPr>
+        <w:t>gym-grpc</w:t>
+      </w:r>
+      <w:r>
+        <w:t xml:space="preserve"> service in </w:t>
+      </w:r>
+      <w:r>
+        <w:rPr>
+          <w:rFonts w:ascii="Consolas" w:eastAsia="Consolas" w:hAnsi="Consolas" w:cs="Consolas"/>
+          <w:sz w:val="19"/>
+          <w:szCs w:val="19"/>
+        </w:rPr>
+        <w:t>docker-compose.yml</w:t>
+      </w:r>
+      <w:r>
+        <w:t xml:space="preserve">, on port 50051, with Prometheus metrics on 9102. The HTTP version stays in the </w:t>
+      </w:r>
+      <w:r>
+        <w:rPr>
+          <w:rFonts w:ascii="Consolas" w:eastAsia="Consolas" w:hAnsi="Consolas" w:cs="Consolas"/>
+          <w:sz w:val="19"/>
+          <w:szCs w:val="19"/>
+        </w:rPr>
+        <w:t>gym-tracker</w:t>
+      </w:r>
+      <w:r>
+        <w:t xml:space="preserve"> app container.</w:t>
+      </w:r>
+    </w:p>
+    <w:p>
+      <w:pPr>
+        <w:pStyle w:val="ListParagraph"/>
+        <w:numPr>
+          <w:ilvl w:val="0"/>
+          <w:numId w:val="2"/>
+        </w:numPr>
+        <w:spacing w:after="60"/>
+      </w:pPr>
+      <w:r>
+        <w:rPr>
+          <w:b/>
+          <w:bCs/>
+        </w:rPr>
+        <w:t>Same business rules, same source of truth.</w:t>
+      </w:r>
+      <w:r>
+        <w:t xml:space="preserve"> Both the HTTP handler (</w:t>
+      </w:r>
+      <w:r>
+        <w:rPr>
+          <w:rFonts w:ascii="Consolas" w:eastAsia="Consolas" w:hAnsi="Consolas" w:cs="Consolas"/>
+          <w:sz w:val="19"/>
+          <w:szCs w:val="19"/>
+        </w:rPr>
+        <w:t>api.log_set</w:t>
+      </w:r>
+      <w:r>
+        <w:t>) and the gRPC handler (</w:t>
+      </w:r>
+      <w:r>
+        <w:rPr>
+          <w:rFonts w:ascii="Consolas" w:eastAsia="Consolas" w:hAnsi="Consolas" w:cs="Consolas"/>
+          <w:sz w:val="19"/>
+          <w:szCs w:val="19"/>
+        </w:rPr>
+        <w:t>WorkoutService._log_set</w:t>
+      </w:r>
+      <w:r>
+        <w:t xml:space="preserve">) call </w:t>
+      </w:r>
+      <w:r>
+        <w:rPr>
+          <w:rFonts w:ascii="Consolas" w:eastAsia="Consolas" w:hAnsi="Consolas" w:cs="Consolas"/>
+          <w:sz w:val="19"/>
+          <w:szCs w:val="19"/>
+        </w:rPr>
+        <w:t>sessions.log_set</w:t>
+      </w:r>
+      <w:r>
+        <w:t xml:space="preserve"> with a connection to the same Postgres database. Validation, ownership checks, record detection and idempotency are one piece of code reached two ways. The gRPC server never calls the HTTP API.</w:t>
+      </w:r>
+    </w:p>
+    <w:p>
+      <w:pPr>
+        <w:pStyle w:val="ListParagraph"/>
+        <w:numPr>
+          <w:ilvl w:val="0"/>
+          <w:numId w:val="2"/>
+        </w:numPr>
+        <w:spacing w:after="60"/>
+      </w:pPr>
+      <w:r>
+        <w:rPr>
+          <w:b/>
+          <w:bCs/>
+        </w:rPr>
+        <w:t>Same accounts.</w:t>
+      </w:r>
+      <w:r>
+        <w:t xml:space="preserve"> Credentials go in the </w:t>
+      </w:r>
+      <w:r>
+        <w:rPr>
+          <w:rFonts w:ascii="Consolas" w:eastAsia="Consolas" w:hAnsi="Consolas" w:cs="Consolas"/>
+          <w:sz w:val="19"/>
+          <w:szCs w:val="19"/>
+        </w:rPr>
+        <w:t>authorization</w:t>
+      </w:r>
+      <w:r>
+        <w:t xml:space="preserve"> metadata as HTTP Basic and are checked with </w:t>
+      </w:r>
+      <w:r>
+        <w:rPr>
+          <w:rFonts w:ascii="Consolas" w:eastAsia="Consolas" w:hAnsi="Consolas" w:cs="Consolas"/>
+          <w:sz w:val="19"/>
+          <w:szCs w:val="19"/>
+        </w:rPr>
+        <w:t>auth.authenticate</w:t>
+      </w:r>
+      <w:r>
+        <w:t xml:space="preserve"> against the same accounts table.</w:t>
+      </w:r>
+    </w:p>
+    <w:p>
+      <w:pPr>
+        <w:pStyle w:val="Heading2"/>
+        <w:keepNext/>
+      </w:pPr>
+      <w:bookmarkStart w:id="10" w:name="_Toc243523454"/>
       <w:r>
         <w:t>B.2 Contract and generated code</w:t>
       </w:r>
@@ -8092,7 +9367,7 @@
         <w:pStyle w:val="Heading2"/>
         <w:keepNext/>
       </w:pPr>
-      <w:bookmarkStart w:id="11" w:name="_Toc243521919"/>
+      <w:bookmarkStart w:id="11" w:name="_Toc243523455"/>
       <w:r>
         <w:t>B.3 The gRPC client</w:t>
       </w:r>
@@ -8200,7 +9475,7 @@
         <w:pStyle w:val="Heading2"/>
         <w:keepNext/>
       </w:pPr>
-      <w:bookmarkStart w:id="12" w:name="_Toc243521920"/>
+      <w:bookmarkStart w:id="12" w:name="_Toc243523456"/>
       <w:r>
         <w:t>B.4 Success and failure through both versions</w:t>
       </w:r>
@@ -9786,26 +11061,216 @@
     </w:p>
     <w:p>
       <w:pPr>
-        <w:pBdr>
-          <w:left w:val="single" w:sz="18" w:space="6" w:color="BF9000"/>
-        </w:pBdr>
-        <w:shd w:val="clear" w:color="auto" w:fill="FFF2CC"/>
-        <w:spacing w:before="80" w:after="200"/>
-        <w:ind w:left="160"/>
-      </w:pPr>
-      <w:r>
-        <w:rPr>
-          <w:b/>
-          <w:bCs/>
-          <w:color w:val="9C5700"/>
-        </w:rPr>
-        <w:t xml:space="preserve">EVIDENCE TO ADD: </w:t>
-      </w:r>
-      <w:r>
-        <w:rPr>
-          <w:color w:val="9C5700"/>
-        </w:rPr>
-        <w:t>optional but useful: paste the console output of grpc_client.py for one success (--reps 8) and one failure (--reps 0).</w:t>
+        <w:spacing w:after="120"/>
+      </w:pPr>
+      <w:r>
+        <w:t>The gRPC client on its own, one success and one failure (</w:t>
+      </w:r>
+      <w:r>
+        <w:rPr>
+          <w:rFonts w:ascii="Consolas" w:eastAsia="Consolas" w:hAnsi="Consolas" w:cs="Consolas"/>
+          <w:sz w:val="19"/>
+          <w:szCs w:val="19"/>
+        </w:rPr>
+        <w:t>observability/results-a2/grpc-client.txt</w:t>
+      </w:r>
+      <w:r>
+        <w:t>):</w:t>
+      </w:r>
+    </w:p>
+    <w:p>
+      <w:pPr>
+        <w:shd w:val="clear" w:color="auto" w:fill="F2F2F2"/>
+        <w:spacing w:line="250" w:lineRule="auto"/>
+        <w:ind w:left="120" w:right="120"/>
+      </w:pPr>
+      <w:r>
+        <w:rPr>
+          <w:rFonts w:ascii="Consolas" w:eastAsia="Consolas" w:hAnsi="Consolas" w:cs="Consolas"/>
+          <w:sz w:val="15"/>
+          <w:szCs w:val="15"/>
+        </w:rPr>
+        <w:t>$ python clients/grpc_client.py --session-id 1 --exercise "Bench Press (Barbell)" --weight 82.5 --reps 8 --request-id a2-grpc-ok</w:t>
+      </w:r>
+    </w:p>
+    <w:p>
+      <w:pPr>
+        <w:shd w:val="clear" w:color="auto" w:fill="F2F2F2"/>
+        <w:spacing w:line="250" w:lineRule="auto"/>
+        <w:ind w:left="120" w:right="120"/>
+      </w:pPr>
+      <w:r>
+        <w:rPr>
+          <w:rFonts w:ascii="Consolas" w:eastAsia="Consolas" w:hAnsi="Consolas" w:cs="Consolas"/>
+          <w:sz w:val="15"/>
+          <w:szCs w:val="15"/>
+        </w:rPr>
+        <w:t>status:     OK (133 ms, deadline 2.0s)</w:t>
+      </w:r>
+    </w:p>
+    <w:p>
+      <w:pPr>
+        <w:shd w:val="clear" w:color="auto" w:fill="F2F2F2"/>
+        <w:spacing w:line="250" w:lineRule="auto"/>
+        <w:ind w:left="120" w:right="120"/>
+      </w:pPr>
+      <w:r>
+        <w:rPr>
+          <w:rFonts w:ascii="Consolas" w:eastAsia="Consolas" w:hAnsi="Consolas" w:cs="Consolas"/>
+          <w:sz w:val="15"/>
+          <w:szCs w:val="15"/>
+        </w:rPr>
+        <w:t>request id: a2-grpc-ok</w:t>
+      </w:r>
+    </w:p>
+    <w:p>
+      <w:pPr>
+        <w:shd w:val="clear" w:color="auto" w:fill="F2F2F2"/>
+        <w:spacing w:line="250" w:lineRule="auto"/>
+        <w:ind w:left="120" w:right="120"/>
+      </w:pPr>
+      <w:r>
+        <w:rPr>
+          <w:rFonts w:ascii="Consolas" w:eastAsia="Consolas" w:hAnsi="Consolas" w:cs="Consolas"/>
+          <w:sz w:val="15"/>
+          <w:szCs w:val="15"/>
+        </w:rPr>
+        <w:t>written:    log_id 48, Bench Press (Barbell) set 12: 82.5 × 8</w:t>
+      </w:r>
+    </w:p>
+    <w:p>
+      <w:pPr>
+        <w:shd w:val="clear" w:color="auto" w:fill="F2F2F2"/>
+        <w:spacing w:line="250" w:lineRule="auto"/>
+        <w:ind w:left="120" w:right="120"/>
+      </w:pPr>
+      <w:r>
+        <w:rPr>
+          <w:rFonts w:ascii="Consolas" w:eastAsia="Consolas" w:hAnsi="Consolas" w:cs="Consolas"/>
+          <w:sz w:val="15"/>
+          <w:szCs w:val="15"/>
+        </w:rPr>
+        <w:t>record:     Heaviest weight 82.5</w:t>
+      </w:r>
+    </w:p>
+    <w:p>
+      <w:pPr>
+        <w:shd w:val="clear" w:color="auto" w:fill="F2F2F2"/>
+        <w:spacing w:line="250" w:lineRule="auto"/>
+        <w:ind w:left="120" w:right="120"/>
+      </w:pPr>
+      <w:r>
+        <w:rPr>
+          <w:rFonts w:ascii="Consolas" w:eastAsia="Consolas" w:hAnsi="Consolas" w:cs="Consolas"/>
+          <w:sz w:val="15"/>
+          <w:szCs w:val="15"/>
+        </w:rPr>
+        <w:t>record:     Best estimated 1RM 104.5</w:t>
+      </w:r>
+    </w:p>
+    <w:p>
+      <w:pPr>
+        <w:shd w:val="clear" w:color="auto" w:fill="F2F2F2"/>
+        <w:spacing w:line="250" w:lineRule="auto"/>
+        <w:ind w:left="120" w:right="120"/>
+      </w:pPr>
+      <w:r>
+        <w:rPr>
+          <w:rFonts w:ascii="Consolas" w:eastAsia="Consolas" w:hAnsi="Consolas" w:cs="Consolas"/>
+          <w:sz w:val="15"/>
+          <w:szCs w:val="15"/>
+        </w:rPr>
+        <w:t>(exit 0)</w:t>
+      </w:r>
+    </w:p>
+    <w:p>
+      <w:pPr>
+        <w:shd w:val="clear" w:color="auto" w:fill="F2F2F2"/>
+        <w:spacing w:line="250" w:lineRule="auto"/>
+        <w:ind w:left="120" w:right="120"/>
+      </w:pPr>
+      <w:r>
+        <w:rPr>
+          <w:rFonts w:ascii="Consolas" w:eastAsia="Consolas" w:hAnsi="Consolas" w:cs="Consolas"/>
+          <w:sz w:val="15"/>
+          <w:szCs w:val="15"/>
+        </w:rPr>
+        <w:t xml:space="preserve"> </w:t>
+      </w:r>
+    </w:p>
+    <w:p>
+      <w:pPr>
+        <w:shd w:val="clear" w:color="auto" w:fill="F2F2F2"/>
+        <w:spacing w:line="250" w:lineRule="auto"/>
+        <w:ind w:left="120" w:right="120"/>
+      </w:pPr>
+      <w:r>
+        <w:rPr>
+          <w:rFonts w:ascii="Consolas" w:eastAsia="Consolas" w:hAnsi="Consolas" w:cs="Consolas"/>
+          <w:sz w:val="15"/>
+          <w:szCs w:val="15"/>
+        </w:rPr>
+        <w:t>$ python clients/grpc_client.py --session-id 1 --exercise "Bench Press (Barbell)" --weight 82.5 --reps 0 --request-id a2-grpc-fail</w:t>
+      </w:r>
+    </w:p>
+    <w:p>
+      <w:pPr>
+        <w:shd w:val="clear" w:color="auto" w:fill="F2F2F2"/>
+        <w:spacing w:line="250" w:lineRule="auto"/>
+        <w:ind w:left="120" w:right="120"/>
+      </w:pPr>
+      <w:r>
+        <w:rPr>
+          <w:rFonts w:ascii="Consolas" w:eastAsia="Consolas" w:hAnsi="Consolas" w:cs="Consolas"/>
+          <w:sz w:val="15"/>
+          <w:szCs w:val="15"/>
+        </w:rPr>
+        <w:t>status:     INVALID_ARGUMENT (123 ms, deadline 2.0s)</w:t>
+      </w:r>
+    </w:p>
+    <w:p>
+      <w:pPr>
+        <w:shd w:val="clear" w:color="auto" w:fill="F2F2F2"/>
+        <w:spacing w:line="250" w:lineRule="auto"/>
+        <w:ind w:left="120" w:right="120"/>
+      </w:pPr>
+      <w:r>
+        <w:rPr>
+          <w:rFonts w:ascii="Consolas" w:eastAsia="Consolas" w:hAnsi="Consolas" w:cs="Consolas"/>
+          <w:sz w:val="15"/>
+          <w:szCs w:val="15"/>
+        </w:rPr>
+        <w:t>request id: a2-grpc-fail</w:t>
+      </w:r>
+    </w:p>
+    <w:p>
+      <w:pPr>
+        <w:shd w:val="clear" w:color="auto" w:fill="F2F2F2"/>
+        <w:spacing w:line="250" w:lineRule="auto"/>
+        <w:ind w:left="120" w:right="120"/>
+      </w:pPr>
+      <w:r>
+        <w:rPr>
+          <w:rFonts w:ascii="Consolas" w:eastAsia="Consolas" w:hAnsi="Consolas" w:cs="Consolas"/>
+          <w:sz w:val="15"/>
+          <w:szCs w:val="15"/>
+        </w:rPr>
+        <w:t>error:      Reps must be between 1 and 500.</w:t>
+      </w:r>
+    </w:p>
+    <w:p>
+      <w:pPr>
+        <w:shd w:val="clear" w:color="auto" w:fill="F2F2F2"/>
+        <w:spacing w:after="160" w:line="250" w:lineRule="auto"/>
+        <w:ind w:left="120" w:right="120"/>
+      </w:pPr>
+      <w:r>
+        <w:rPr>
+          <w:rFonts w:ascii="Consolas" w:eastAsia="Consolas" w:hAnsi="Consolas" w:cs="Consolas"/>
+          <w:sz w:val="15"/>
+          <w:szCs w:val="15"/>
+        </w:rPr>
+        <w:t>(exit 1)</w:t>
       </w:r>
     </w:p>
     <w:p>
@@ -9813,7 +11278,7 @@
         <w:pStyle w:val="Heading2"/>
         <w:keepNext/>
       </w:pPr>
-      <w:bookmarkStart w:id="13" w:name="_Toc243521921"/>
+      <w:bookmarkStart w:id="13" w:name="_Toc243523457"/>
       <w:r>
         <w:t>B.5 Call paths</w:t>
       </w:r>
@@ -9829,10 +11294,10 @@
           <w:noProof/>
         </w:rPr>
         <w:drawing>
-          <wp:inline distT="0" distB="0" distL="0" distR="0" wp14:anchorId="4715D575" wp14:editId="4715D576">
+          <wp:inline distT="0" distB="0" distL="0" distR="0" wp14:anchorId="5BBD5E18" wp14:editId="5BBD5E19">
             <wp:extent cx="5715000" cy="3733800"/>
             <wp:effectExtent l="0" t="0" r="0" b="0"/>
-            <wp:docPr id="1" name="Picture 1"/>
+            <wp:docPr id="3" name="Picture 3"/>
             <wp:cNvGraphicFramePr>
               <a:graphicFrameLocks xmlns:a="http://schemas.openxmlformats.org/drawingml/2006/main" noChangeAspect="1"/>
             </wp:cNvGraphicFramePr>
@@ -9846,7 +11311,7 @@
                     </pic:cNvPicPr>
                   </pic:nvPicPr>
                   <pic:blipFill>
-                    <a:blip r:embed="rId7"/>
+                    <a:blip r:embed="rId9"/>
                     <a:srcRect/>
                     <a:stretch>
                       <a:fillRect/>
@@ -9888,7 +11353,7 @@
         <w:pStyle w:val="Heading2"/>
         <w:keepNext/>
       </w:pPr>
-      <w:bookmarkStart w:id="14" w:name="_Toc243521922"/>
+      <w:bookmarkStart w:id="14" w:name="_Toc243523458"/>
       <w:r>
         <w:t>B.6 Logs and trace correlation across the gRPC boundary</w:t>
       </w:r>
@@ -10069,7 +11534,7 @@
         <w:spacing w:after="60"/>
       </w:pPr>
       <w:r>
-        <w:t xml:space="preserve">So one Kibana search, </w:t>
+        <w:t xml:space="preserve">So one Kibana search on </w:t>
       </w:r>
       <w:r>
         <w:rPr>
@@ -10077,10 +11542,10 @@
           <w:sz w:val="19"/>
           <w:szCs w:val="19"/>
         </w:rPr>
-        <w:t>http.request.id: "a2-demo-1"</w:t>
-      </w:r>
-      <w:r>
-        <w:t xml:space="preserve">, finds a gRPC call made with </w:t>
+        <w:t>http.request.id</w:t>
+      </w:r>
+      <w:r>
+        <w:t xml:space="preserve"> finds a gRPC call made with </w:t>
       </w:r>
       <w:r>
         <w:rPr>
@@ -10088,34 +11553,96 @@
           <w:sz w:val="19"/>
           <w:szCs w:val="19"/>
         </w:rPr>
-        <w:t>--request-id a2-demo-1</w:t>
-      </w:r>
-      <w:r>
-        <w:t>, just as it finds an HTTP request.</w:t>
-      </w:r>
-    </w:p>
-    <w:p>
-      <w:pPr>
-        <w:pBdr>
-          <w:left w:val="single" w:sz="18" w:space="6" w:color="BF9000"/>
-        </w:pBdr>
-        <w:shd w:val="clear" w:color="auto" w:fill="FFF2CC"/>
-        <w:spacing w:before="80" w:after="200"/>
-        <w:ind w:left="160"/>
-      </w:pPr>
-      <w:r>
-        <w:rPr>
-          <w:b/>
-          <w:bCs/>
-          <w:color w:val="9C5700"/>
-        </w:rPr>
-        <w:t xml:space="preserve">EVIDENCE TO ADD: </w:t>
-      </w:r>
-      <w:r>
-        <w:rPr>
-          <w:color w:val="9C5700"/>
-        </w:rPr>
-        <w:t>Kibana screenshot of the search http.request.id: "a2-demo-1" showing the 'rpc served' and 'set logged' lines from gym-tracker-grpc.</w:t>
+        <w:t>--request-id</w:t>
+      </w:r>
+      <w:r>
+        <w:t>, just as it finds an HTTP request. Figure B.2 uses the two calls from B.4 (</w:t>
+      </w:r>
+      <w:r>
+        <w:rPr>
+          <w:rFonts w:ascii="Consolas" w:eastAsia="Consolas" w:hAnsi="Consolas" w:cs="Consolas"/>
+          <w:sz w:val="19"/>
+          <w:szCs w:val="19"/>
+        </w:rPr>
+        <w:t>a2-grpc-ok</w:t>
+      </w:r>
+      <w:r>
+        <w:t xml:space="preserve">, </w:t>
+      </w:r>
+      <w:r>
+        <w:rPr>
+          <w:rFonts w:ascii="Consolas" w:eastAsia="Consolas" w:hAnsi="Consolas" w:cs="Consolas"/>
+          <w:sz w:val="19"/>
+          <w:szCs w:val="19"/>
+        </w:rPr>
+        <w:t>a2-grpc-fail</w:t>
+      </w:r>
+      <w:r>
+        <w:t>).</w:t>
+      </w:r>
+    </w:p>
+    <w:p>
+      <w:pPr>
+        <w:spacing w:after="60"/>
+        <w:jc w:val="center"/>
+      </w:pPr>
+      <w:r>
+        <w:rPr>
+          <w:noProof/>
+        </w:rPr>
+        <w:drawing>
+          <wp:inline distT="0" distB="0" distL="0" distR="0" wp14:anchorId="5BBD5E1A" wp14:editId="5BBD5E1B">
+            <wp:extent cx="5715000" cy="3190875"/>
+            <wp:effectExtent l="0" t="0" r="0" b="0"/>
+            <wp:docPr id="4" name="Picture 4"/>
+            <wp:cNvGraphicFramePr>
+              <a:graphicFrameLocks xmlns:a="http://schemas.openxmlformats.org/drawingml/2006/main" noChangeAspect="1"/>
+            </wp:cNvGraphicFramePr>
+            <a:graphic xmlns:a="http://schemas.openxmlformats.org/drawingml/2006/main">
+              <a:graphicData uri="http://schemas.openxmlformats.org/drawingml/2006/picture">
+                <pic:pic xmlns:pic="http://schemas.openxmlformats.org/drawingml/2006/picture">
+                  <pic:nvPicPr>
+                    <pic:cNvPr id="0" name=""/>
+                    <pic:cNvPicPr>
+                      <a:picLocks noChangeAspect="1" noChangeArrowheads="1"/>
+                    </pic:cNvPicPr>
+                  </pic:nvPicPr>
+                  <pic:blipFill>
+                    <a:blip r:embed="rId10"/>
+                    <a:srcRect/>
+                    <a:stretch>
+                      <a:fillRect/>
+                    </a:stretch>
+                  </pic:blipFill>
+                  <pic:spPr bwMode="auto">
+                    <a:xfrm>
+                      <a:off x="0" y="0"/>
+                      <a:ext cx="5715000" cy="3190875"/>
+                    </a:xfrm>
+                    <a:prstGeom prst="rect">
+                      <a:avLst/>
+                    </a:prstGeom>
+                  </pic:spPr>
+                </pic:pic>
+              </a:graphicData>
+            </a:graphic>
+          </wp:inline>
+        </w:drawing>
+      </w:r>
+    </w:p>
+    <w:p>
+      <w:pPr>
+        <w:spacing w:after="200"/>
+      </w:pPr>
+      <w:r>
+        <w:rPr>
+          <w:i/>
+          <w:iCs/>
+          <w:color w:val="555555"/>
+          <w:sz w:val="18"/>
+          <w:szCs w:val="18"/>
+        </w:rPr>
+        <w:t>Figure B.2. Kibana Discover, http.request.id: "a2-grpc-ok" or "a2-grpc-fail". All four lines come from service gym-tracker-grpc: for the success, personal record beaten, set logged and rpc served (OK, 76 ms); for the failure, rpc served (INVALID_ARGUMENT, 70.8 ms).</w:t>
       </w:r>
     </w:p>
     <w:p>
@@ -10127,7 +11654,7 @@
       <w:pPr>
         <w:pStyle w:val="Heading1"/>
       </w:pPr>
-      <w:bookmarkStart w:id="15" w:name="_Toc243521923"/>
+      <w:bookmarkStart w:id="15" w:name="_Toc243523459"/>
       <w:r>
         <w:t>Part C: Extending the metrics</w:t>
       </w:r>
@@ -10138,7 +11665,7 @@
         <w:pStyle w:val="Heading2"/>
         <w:keepNext/>
       </w:pPr>
-      <w:bookmarkStart w:id="16" w:name="_Toc243521924"/>
+      <w:bookmarkStart w:id="16" w:name="_Toc243523460"/>
       <w:r>
         <w:t>C.1 Audit of the Assignment 1 metrics</w:t>
       </w:r>
@@ -10924,7 +12451,7 @@
         <w:pStyle w:val="Heading2"/>
         <w:keepNext/>
       </w:pPr>
-      <w:bookmarkStart w:id="17" w:name="_Toc243521925"/>
+      <w:bookmarkStart w:id="17" w:name="_Toc243523461"/>
       <w:r>
         <w:t>C.2 New metrics</w:t>
       </w:r>
@@ -12695,7 +14222,7 @@
         <w:pStyle w:val="Heading2"/>
         <w:keepNext/>
       </w:pPr>
-      <w:bookmarkStart w:id="18" w:name="_Toc243521926"/>
+      <w:bookmarkStart w:id="18" w:name="_Toc243523462"/>
       <w:r>
         <w:t>C.3 Prometheus and Grafana</w:t>
       </w:r>
@@ -13216,26 +14743,245 @@
     </w:p>
     <w:p>
       <w:pPr>
-        <w:pBdr>
-          <w:left w:val="single" w:sz="18" w:space="6" w:color="BF9000"/>
-        </w:pBdr>
-        <w:shd w:val="clear" w:color="auto" w:fill="FFF2CC"/>
-        <w:spacing w:before="80" w:after="200"/>
-        <w:ind w:left="160"/>
+        <w:spacing w:after="60"/>
+        <w:jc w:val="center"/>
+      </w:pPr>
+      <w:r>
+        <w:rPr>
+          <w:noProof/>
+        </w:rPr>
+        <w:drawing>
+          <wp:inline distT="0" distB="0" distL="0" distR="0" wp14:anchorId="5BBD5E1C" wp14:editId="5BBD5E1D">
+            <wp:extent cx="5715000" cy="1790700"/>
+            <wp:effectExtent l="0" t="0" r="0" b="0"/>
+            <wp:docPr id="5" name="Picture 5"/>
+            <wp:cNvGraphicFramePr>
+              <a:graphicFrameLocks xmlns:a="http://schemas.openxmlformats.org/drawingml/2006/main" noChangeAspect="1"/>
+            </wp:cNvGraphicFramePr>
+            <a:graphic xmlns:a="http://schemas.openxmlformats.org/drawingml/2006/main">
+              <a:graphicData uri="http://schemas.openxmlformats.org/drawingml/2006/picture">
+                <pic:pic xmlns:pic="http://schemas.openxmlformats.org/drawingml/2006/picture">
+                  <pic:nvPicPr>
+                    <pic:cNvPr id="0" name=""/>
+                    <pic:cNvPicPr>
+                      <a:picLocks noChangeAspect="1" noChangeArrowheads="1"/>
+                    </pic:cNvPicPr>
+                  </pic:nvPicPr>
+                  <pic:blipFill>
+                    <a:blip r:embed="rId11"/>
+                    <a:srcRect/>
+                    <a:stretch>
+                      <a:fillRect/>
+                    </a:stretch>
+                  </pic:blipFill>
+                  <pic:spPr bwMode="auto">
+                    <a:xfrm>
+                      <a:off x="0" y="0"/>
+                      <a:ext cx="5715000" cy="1790700"/>
+                    </a:xfrm>
+                    <a:prstGeom prst="rect">
+                      <a:avLst/>
+                    </a:prstGeom>
+                  </pic:spPr>
+                </pic:pic>
+              </a:graphicData>
+            </a:graphic>
+          </wp:inline>
+        </w:drawing>
+      </w:r>
+    </w:p>
+    <w:p>
+      <w:pPr>
+        <w:spacing w:after="200"/>
+      </w:pPr>
+      <w:r>
+        <w:rPr>
+          <w:i/>
+          <w:iCs/>
+          <w:color w:val="555555"/>
+          <w:sz w:val="18"/>
+          <w:szCs w:val="18"/>
+        </w:rPr>
+        <w:t>Figure C.1. Prometheus Status → Targets: the gym-tracker-grpc job (grpc:9102) is UP beside the HTTP app.</w:t>
+      </w:r>
+    </w:p>
+    <w:p>
+      <w:pPr>
+        <w:spacing w:after="60"/>
+        <w:jc w:val="center"/>
+      </w:pPr>
+      <w:r>
+        <w:rPr>
+          <w:noProof/>
+        </w:rPr>
+        <w:drawing>
+          <wp:inline distT="0" distB="0" distL="0" distR="0" wp14:anchorId="5BBD5E1E" wp14:editId="5BBD5E1F">
+            <wp:extent cx="5715000" cy="4819650"/>
+            <wp:effectExtent l="0" t="0" r="0" b="0"/>
+            <wp:docPr id="6" name="Picture 6"/>
+            <wp:cNvGraphicFramePr>
+              <a:graphicFrameLocks xmlns:a="http://schemas.openxmlformats.org/drawingml/2006/main" noChangeAspect="1"/>
+            </wp:cNvGraphicFramePr>
+            <a:graphic xmlns:a="http://schemas.openxmlformats.org/drawingml/2006/main">
+              <a:graphicData uri="http://schemas.openxmlformats.org/drawingml/2006/picture">
+                <pic:pic xmlns:pic="http://schemas.openxmlformats.org/drawingml/2006/picture">
+                  <pic:nvPicPr>
+                    <pic:cNvPr id="0" name=""/>
+                    <pic:cNvPicPr>
+                      <a:picLocks noChangeAspect="1" noChangeArrowheads="1"/>
+                    </pic:cNvPicPr>
+                  </pic:nvPicPr>
+                  <pic:blipFill>
+                    <a:blip r:embed="rId12"/>
+                    <a:srcRect/>
+                    <a:stretch>
+                      <a:fillRect/>
+                    </a:stretch>
+                  </pic:blipFill>
+                  <pic:spPr bwMode="auto">
+                    <a:xfrm>
+                      <a:off x="0" y="0"/>
+                      <a:ext cx="5715000" cy="4819650"/>
+                    </a:xfrm>
+                    <a:prstGeom prst="rect">
+                      <a:avLst/>
+                    </a:prstGeom>
+                  </pic:spPr>
+                </pic:pic>
+              </a:graphicData>
+            </a:graphic>
+          </wp:inline>
+        </w:drawing>
+      </w:r>
+    </w:p>
+    <w:p>
+      <w:pPr>
+        <w:spacing w:after="200"/>
+      </w:pPr>
+      <w:r>
+        <w:rPr>
+          <w:i/>
+          <w:iCs/>
+          <w:color w:val="555555"/>
+          <w:sz w:val="18"/>
+          <w:szCs w:val="18"/>
+        </w:rPr>
+        <w:t>Figure C.2. The HTTP vs gRPC dashboard over 20 minutes, after several runs of scripts/a2_traffic.py and the reliability demo.</w:t>
+      </w:r>
+    </w:p>
+    <w:p>
+      <w:pPr>
+        <w:keepNext/>
+        <w:spacing w:after="120"/>
       </w:pPr>
       <w:r>
         <w:rPr>
           <w:b/>
           <w:bCs/>
-          <w:color w:val="9C5700"/>
-        </w:rPr>
-        <w:t xml:space="preserve">EVIDENCE TO ADD: </w:t>
-      </w:r>
-      <w:r>
-        <w:rPr>
-          <w:color w:val="9C5700"/>
-        </w:rPr>
-        <w:t>screenshot of the 'Gym Tracker - HTTP vs gRPC (log a set)' dashboard after running scripts/a2_traffic.py a few times, plus Prometheus Status → Targets showing gym-tracker-grpc UP.</w:t>
+        </w:rPr>
+        <w:t>Reading the dashboard:</w:t>
+      </w:r>
+    </w:p>
+    <w:p>
+      <w:pPr>
+        <w:pStyle w:val="ListParagraph"/>
+        <w:numPr>
+          <w:ilvl w:val="0"/>
+          <w:numId w:val="2"/>
+        </w:numPr>
+        <w:spacing w:after="60"/>
+      </w:pPr>
+      <w:r>
+        <w:rPr>
+          <w:b/>
+          <w:bCs/>
+        </w:rPr>
+        <w:t>Error ratios of 50–61 %</w:t>
+      </w:r>
+      <w:r>
+        <w:t xml:space="preserve"> are by design: each round of the traffic script sends one valid call, one replay, one invalid and one not-found call, so half the gRPC calls are failures (INVALID_ARGUMENT, NOT_FOUND). HTTP is higher because the reliability demo's refused and aborted calls are counted there as well.</w:t>
+      </w:r>
+    </w:p>
+    <w:p>
+      <w:pPr>
+        <w:pStyle w:val="ListParagraph"/>
+        <w:numPr>
+          <w:ilvl w:val="0"/>
+          <w:numId w:val="2"/>
+        </w:numPr>
+        <w:spacing w:after="60"/>
+      </w:pPr>
+      <w:r>
+        <w:rPr>
+          <w:b/>
+          <w:bCs/>
+        </w:rPr>
+        <w:t>Duration:</w:t>
+      </w:r>
+      <w:r>
+        <w:t xml:space="preserve"> gRPC LogSet p50 is about 74 ms and p95 about 98 ms. HTTP p50 is about 90 ms, but HTTP p95 reaches about 4.4 s while the reliability demo was running, because of its injected 3 s delay on every 4th request. It falls back to about 99 ms once the fault is removed. This is the latency fault showing up in the histogram's upper buckets, as intended.</w:t>
+      </w:r>
+    </w:p>
+    <w:p>
+      <w:pPr>
+        <w:pStyle w:val="ListParagraph"/>
+        <w:numPr>
+          <w:ilvl w:val="0"/>
+          <w:numId w:val="2"/>
+        </w:numPr>
+        <w:spacing w:after="60"/>
+      </w:pPr>
+      <w:r>
+        <w:rPr>
+          <w:b/>
+          <w:bCs/>
+        </w:rPr>
+        <w:t>Duplicate sets prevented: 40.</w:t>
+      </w:r>
+      <w:r>
+        <w:t xml:space="preserve"> Each replayed request (same Idempotency-Key) over either transport is counted by </w:t>
+      </w:r>
+      <w:r>
+        <w:rPr>
+          <w:rFonts w:ascii="Consolas" w:eastAsia="Consolas" w:hAnsi="Consolas" w:cs="Consolas"/>
+          <w:sz w:val="19"/>
+          <w:szCs w:val="19"/>
+        </w:rPr>
+        <w:t>gym_live_sets_total{outcome="replayed"}</w:t>
+      </w:r>
+      <w:r>
+        <w:t>.</w:t>
+      </w:r>
+    </w:p>
+    <w:p>
+      <w:pPr>
+        <w:pStyle w:val="ListParagraph"/>
+        <w:numPr>
+          <w:ilvl w:val="0"/>
+          <w:numId w:val="2"/>
+        </w:numPr>
+        <w:spacing w:after="60"/>
+      </w:pPr>
+      <w:r>
+        <w:rPr>
+          <w:b/>
+          <w:bCs/>
+        </w:rPr>
+        <w:t>Rate limiting:</w:t>
+      </w:r>
+      <w:r>
+        <w:t xml:space="preserve"> the bottom panel shows the 200s, and then the 429s from repeated </w:t>
+      </w:r>
+      <w:r>
+        <w:rPr>
+          <w:rFonts w:ascii="Consolas" w:eastAsia="Consolas" w:hAnsi="Consolas" w:cs="Consolas"/>
+          <w:sz w:val="19"/>
+          <w:szCs w:val="19"/>
+        </w:rPr>
+        <w:t>POST /api/records/rebuild</w:t>
+      </w:r>
+      <w:r>
+        <w:t xml:space="preserve"> bursts.</w:t>
       </w:r>
     </w:p>
     <w:p>
@@ -13247,7 +14993,7 @@
       <w:pPr>
         <w:pStyle w:val="Heading1"/>
       </w:pPr>
-      <w:bookmarkStart w:id="19" w:name="_Toc243521927"/>
+      <w:bookmarkStart w:id="19" w:name="_Toc243523463"/>
       <w:r>
         <w:t>Submission contents</w:t>
       </w:r>
@@ -14255,7 +16001,7 @@
         <w:pStyle w:val="Heading2"/>
         <w:keepNext/>
       </w:pPr>
-      <w:bookmarkStart w:id="20" w:name="_Toc243521928"/>
+      <w:bookmarkStart w:id="20" w:name="_Toc243523464"/>
       <w:r>
         <w:t>References and reused work</w:t>
       </w:r>
@@ -14360,7 +16106,7 @@
       </w:r>
     </w:p>
     <w:sectPr>
-      <w:footerReference w:type="default" r:id="rId8"/>
+      <w:footerReference w:type="default" r:id="rId13"/>
       <w:pgSz w:w="11906" w:h="16838"/>
       <w:pgMar w:top="1440" w:right="1440" w:bottom="1440" w:left="1440" w:header="708" w:footer="708" w:gutter="0"/>
       <w:cols w:space="720"/>
@@ -14462,10 +16208,10 @@
 <file path=word/numbering.xml><?xml version="1.0" encoding="utf-8"?>
 <w:numbering xmlns:wpc="http://schemas.microsoft.com/office/word/2010/wordprocessingCanvas" xmlns:cx="http://schemas.microsoft.com/office/drawing/2014/chartex" xmlns:cx1="http://schemas.microsoft.com/office/drawing/2015/9/8/chartex" xmlns:cx2="http://schemas.microsoft.com/office/drawing/2015/10/21/chartex" xmlns:cx3="http://schemas.microsoft.com/office/drawing/2016/5/9/chartex" xmlns:cx4="http://schemas.microsoft.com/office/drawing/2016/5/10/chartex" xmlns:cx5="http://schemas.microsoft.com/office/drawing/2016/5/11/chartex" xmlns:cx6="http://schemas.microsoft.com/office/drawing/2016/5/12/chartex" xmlns:cx7="http://schemas.microsoft.com/office/drawing/2016/5/13/chartex" xmlns:cx8="http://schemas.microsoft.com/office/drawing/2016/5/14/chartex" xmlns:mc="http://schemas.openxmlformats.org/markup-compatibility/2006" xmlns:aink="http://schemas.microsoft.com/office/drawing/2016/ink" xmlns:am3d="http://schemas.microsoft.com/office/drawing/2017/model3d" xmlns:o="urn:schemas-microsoft-com:office:office" xmlns:oel="http://schemas.microsoft.com/office/2019/extlst" xmlns:r="http://schemas.openxmlformats.org/officeDocument/2006/relationships" xmlns:m="http://schemas.openxmlformats.org/officeDocument/2006/math" xmlns:v="urn:schemas-microsoft-com:vml" xmlns:wp14="http://schemas.microsoft.com/office/word/2010/wordprocessingDrawing" xmlns:wp="http://schemas.openxmlformats.org/drawingml/2006/wordprocessingDrawing" xmlns:w10="urn:schemas-microsoft-com:office:word" xmlns:w="http://schemas.openxmlformats.org/wordprocessingml/2006/main" xmlns:w14="http://schemas.microsoft.com/office/word/2010/wordml" xmlns:w15="http://schemas.microsoft.com/office/word/2012/wordml" xmlns:w16cex="http://schemas.microsoft.com/office/word/2018/wordml/cex" xmlns:w16cid="http://schemas.microsoft.com/office/word/2016/wordml/cid" xmlns:w16="http://schemas.microsoft.com/office/word/2018/wordml" xmlns:w16du="http://schemas.microsoft.com/office/word/2023/wordml/word16du" xmlns:w16sdtdh="http://schemas.microsoft.com/office/word/2020/wordml/sdtdatahash" xmlns:w16sdtfl="http://schemas.microsoft.com/office/word/2024/wordml/sdtformatlock" xmlns:w16se="http://schemas.microsoft.com/office/word/2015/wordml/symex" xmlns:wpg="http://schemas.microsoft.com/office/word/2010/wordprocessingGroup" xmlns:wpi="http://schemas.microsoft.com/office/word/2010/wordprocessingInk" xmlns:wne="http://schemas.microsoft.com/office/word/2006/wordml" xmlns:wps="http://schemas.microsoft.com/office/word/2010/wordprocessingShape" mc:Ignorable="w14 w15 w16se w16cid w16 w16cex w16sdtdh w16sdtfl w16du wp14">
   <w:abstractNum w:abstractNumId="0" w15:restartNumberingAfterBreak="0">
-    <w:nsid w:val="2B577658"/>
+    <w:nsid w:val="0A6D3B6A"/>
     <w:multiLevelType w:val="hybridMultilevel"/>
-    <w:tmpl w:val="D65AF838"/>
-    <w:lvl w:ilvl="0" w:tplc="10B8D958" w:tentative="1">
+    <w:tmpl w:val="13146DEE"/>
+    <w:lvl w:ilvl="0" w:tplc="C4A6B662" w:tentative="1">
       <w:start w:val="1"/>
       <w:numFmt w:val="bullet"/>
       <w:lvlText w:val="●"/>
@@ -14474,7 +16220,7 @@
         <w:ind w:left="720" w:hanging="360"/>
       </w:pPr>
     </w:lvl>
-    <w:lvl w:ilvl="1" w:tplc="C7602370" w:tentative="1">
+    <w:lvl w:ilvl="1" w:tplc="81BA5FBA" w:tentative="1">
       <w:start w:val="1"/>
       <w:numFmt w:val="bullet"/>
       <w:lvlText w:val="○"/>
@@ -14483,7 +16229,7 @@
         <w:ind w:left="1440" w:hanging="360"/>
       </w:pPr>
     </w:lvl>
-    <w:lvl w:ilvl="2" w:tplc="D5441FA0" w:tentative="1">
+    <w:lvl w:ilvl="2" w:tplc="DC1CB82A" w:tentative="1">
       <w:start w:val="1"/>
       <w:numFmt w:val="bullet"/>
       <w:lvlText w:val="■"/>
@@ -14492,7 +16238,7 @@
         <w:ind w:left="2160" w:hanging="360"/>
       </w:pPr>
     </w:lvl>
-    <w:lvl w:ilvl="3" w:tplc="AB02D71C" w:tentative="1">
+    <w:lvl w:ilvl="3" w:tplc="ABC2CBF8" w:tentative="1">
       <w:start w:val="1"/>
       <w:numFmt w:val="bullet"/>
       <w:lvlText w:val="●"/>
@@ -14501,7 +16247,7 @@
         <w:ind w:left="2880" w:hanging="360"/>
       </w:pPr>
     </w:lvl>
-    <w:lvl w:ilvl="4" w:tplc="045C93D0" w:tentative="1">
+    <w:lvl w:ilvl="4" w:tplc="8188C022" w:tentative="1">
       <w:start w:val="1"/>
       <w:numFmt w:val="bullet"/>
       <w:lvlText w:val="○"/>
@@ -14510,7 +16256,7 @@
         <w:ind w:left="3600" w:hanging="360"/>
       </w:pPr>
     </w:lvl>
-    <w:lvl w:ilvl="5" w:tplc="0D0C0AEE" w:tentative="1">
+    <w:lvl w:ilvl="5" w:tplc="8604B074" w:tentative="1">
       <w:start w:val="1"/>
       <w:numFmt w:val="bullet"/>
       <w:lvlText w:val="■"/>
@@ -14519,7 +16265,7 @@
         <w:ind w:left="4320" w:hanging="360"/>
       </w:pPr>
     </w:lvl>
-    <w:lvl w:ilvl="6" w:tplc="A17A45AE" w:tentative="1">
+    <w:lvl w:ilvl="6" w:tplc="EEB084C4" w:tentative="1">
       <w:start w:val="1"/>
       <w:numFmt w:val="bullet"/>
       <w:lvlText w:val="●"/>
@@ -14528,7 +16274,7 @@
         <w:ind w:left="5040" w:hanging="360"/>
       </w:pPr>
     </w:lvl>
-    <w:lvl w:ilvl="7" w:tplc="B4BE8F40" w:tentative="1">
+    <w:lvl w:ilvl="7" w:tplc="E31678A2" w:tentative="1">
       <w:start w:val="1"/>
       <w:numFmt w:val="bullet"/>
       <w:lvlText w:val="●"/>
@@ -14537,7 +16283,7 @@
         <w:ind w:left="5760" w:hanging="360"/>
       </w:pPr>
     </w:lvl>
-    <w:lvl w:ilvl="8" w:tplc="1A7A0B08" w:tentative="1">
+    <w:lvl w:ilvl="8" w:tplc="436A8822" w:tentative="1">
       <w:start w:val="1"/>
       <w:numFmt w:val="bullet"/>
       <w:lvlText w:val="●"/>
@@ -14548,10 +16294,10 @@
     </w:lvl>
   </w:abstractNum>
   <w:abstractNum w:abstractNumId="1" w15:restartNumberingAfterBreak="0">
-    <w:nsid w:val="7CC15958"/>
+    <w:nsid w:val="71BE47B9"/>
     <w:multiLevelType w:val="hybridMultilevel"/>
-    <w:tmpl w:val="8B3631A4"/>
-    <w:lvl w:ilvl="0" w:tplc="AEE4D332">
+    <w:tmpl w:val="7136AF20"/>
+    <w:lvl w:ilvl="0" w:tplc="F31E45BA">
       <w:start w:val="1"/>
       <w:numFmt w:val="bullet"/>
       <w:lvlText w:val="•"/>
@@ -14560,54 +16306,54 @@
         <w:ind w:left="540" w:hanging="270"/>
       </w:pPr>
     </w:lvl>
-    <w:lvl w:ilvl="1" w:tplc="D9A89D24">
+    <w:lvl w:ilvl="1" w:tplc="5E96243E">
       <w:numFmt w:val="decimal"/>
       <w:lvlText w:val=""/>
       <w:lvlJc w:val="left"/>
     </w:lvl>
-    <w:lvl w:ilvl="2" w:tplc="FF5645FE">
+    <w:lvl w:ilvl="2" w:tplc="DB04AA42">
       <w:numFmt w:val="decimal"/>
       <w:lvlText w:val=""/>
       <w:lvlJc w:val="left"/>
     </w:lvl>
-    <w:lvl w:ilvl="3" w:tplc="ABFC8D86">
+    <w:lvl w:ilvl="3" w:tplc="4AB43FE0">
       <w:numFmt w:val="decimal"/>
       <w:lvlText w:val=""/>
       <w:lvlJc w:val="left"/>
     </w:lvl>
-    <w:lvl w:ilvl="4" w:tplc="F3583A16">
+    <w:lvl w:ilvl="4" w:tplc="F5520C82">
       <w:numFmt w:val="decimal"/>
       <w:lvlText w:val=""/>
       <w:lvlJc w:val="left"/>
     </w:lvl>
-    <w:lvl w:ilvl="5" w:tplc="DF148BA4">
+    <w:lvl w:ilvl="5" w:tplc="42066612">
       <w:numFmt w:val="decimal"/>
       <w:lvlText w:val=""/>
       <w:lvlJc w:val="left"/>
     </w:lvl>
-    <w:lvl w:ilvl="6" w:tplc="9FDC5BE6">
+    <w:lvl w:ilvl="6" w:tplc="41C81534">
       <w:numFmt w:val="decimal"/>
       <w:lvlText w:val=""/>
       <w:lvlJc w:val="left"/>
     </w:lvl>
-    <w:lvl w:ilvl="7" w:tplc="FC1669C4">
+    <w:lvl w:ilvl="7" w:tplc="A8B80AD4">
       <w:numFmt w:val="decimal"/>
       <w:lvlText w:val=""/>
       <w:lvlJc w:val="left"/>
     </w:lvl>
-    <w:lvl w:ilvl="8" w:tplc="02C6C494">
+    <w:lvl w:ilvl="8" w:tplc="D504A9D6">
       <w:numFmt w:val="decimal"/>
       <w:lvlText w:val=""/>
       <w:lvlJc w:val="left"/>
     </w:lvl>
   </w:abstractNum>
-  <w:num w:numId="1" w16cid:durableId="664894472">
+  <w:num w:numId="1" w16cid:durableId="1368481371">
     <w:abstractNumId w:val="0"/>
     <w:lvlOverride w:ilvl="0">
       <w:startOverride w:val="1"/>
     </w:lvlOverride>
   </w:num>
-  <w:num w:numId="2" w16cid:durableId="1712000088">
+  <w:num w:numId="2" w16cid:durableId="425656671">
     <w:abstractNumId w:val="1"/>
     <w:lvlOverride w:ilvl="0">
       <w:startOverride w:val="1"/>
@@ -15245,7 +16991,7 @@
     <w:autoRedefine/>
     <w:uiPriority w:val="39"/>
     <w:unhideWhenUsed/>
-    <w:rsid w:val="00450B56"/>
+    <w:rsid w:val="007D38F7"/>
     <w:pPr>
       <w:spacing w:after="100"/>
     </w:pPr>
@@ -15257,7 +17003,7 @@
     <w:autoRedefine/>
     <w:uiPriority w:val="39"/>
     <w:unhideWhenUsed/>
-    <w:rsid w:val="00450B56"/>
+    <w:rsid w:val="007D38F7"/>
     <w:pPr>
       <w:spacing w:after="100"/>
       <w:ind w:left="210"/>

</xml_diff>

<commit_message>
Remove the workshop citation placeholder from the A2 report
Nothing was reused from the course gRPC workshop, so the references
no longer mention it.

Co-Authored-By: Claude Opus 5.5 <noreply@anthropic.com>
</commit_message>
<xml_diff>
--- a/docs/Assignment2-HTTP-gRPC-Metrics.docx
+++ b/docs/Assignment2-HTTP-gRPC-Metrics.docx
@@ -188,7 +188,7 @@
     <w:sdt>
       <w:sdtPr>
         <w:alias w:val="Contents"/>
-        <w:id w:val="1024599126"/>
+        <w:id w:val="-1674101526"/>
       </w:sdtPr>
       <w:sdtEndPr/>
       <w:sdtContent>
@@ -211,7 +211,7 @@
           <w:r>
             <w:fldChar w:fldCharType="separate"/>
           </w:r>
-          <w:hyperlink w:anchor="_Toc243773522" w:history="1">
+          <w:hyperlink w:anchor="_Toc243783595" w:history="1">
             <w:r>
               <w:rPr>
                 <w:rStyle w:val="Hyperlink"/>
@@ -235,7 +235,7 @@
               <w:rPr>
                 <w:noProof/>
               </w:rPr>
-              <w:instrText xml:space="preserve"> PAGEREF _Toc243773522 \h </w:instrText>
+              <w:instrText xml:space="preserve"> PAGEREF _Toc243783595 \h </w:instrText>
             </w:r>
             <w:r>
               <w:rPr>
@@ -272,7 +272,7 @@
               <w:noProof/>
             </w:rPr>
           </w:pPr>
-          <w:hyperlink w:anchor="_Toc243773523" w:history="1">
+          <w:hyperlink w:anchor="_Toc243783596" w:history="1">
             <w:r>
               <w:rPr>
                 <w:rStyle w:val="Hyperlink"/>
@@ -296,7 +296,7 @@
               <w:rPr>
                 <w:noProof/>
               </w:rPr>
-              <w:instrText xml:space="preserve"> PAGEREF _Toc243773523 \h </w:instrText>
+              <w:instrText xml:space="preserve"> PAGEREF _Toc243783596 \h </w:instrText>
             </w:r>
             <w:r>
               <w:rPr>
@@ -333,7 +333,7 @@
               <w:noProof/>
             </w:rPr>
           </w:pPr>
-          <w:hyperlink w:anchor="_Toc243773524" w:history="1">
+          <w:hyperlink w:anchor="_Toc243783597" w:history="1">
             <w:r>
               <w:rPr>
                 <w:rStyle w:val="Hyperlink"/>
@@ -357,7 +357,7 @@
               <w:rPr>
                 <w:noProof/>
               </w:rPr>
-              <w:instrText xml:space="preserve"> PAGEREF _Toc243773524 \h </w:instrText>
+              <w:instrText xml:space="preserve"> PAGEREF _Toc243783597 \h </w:instrText>
             </w:r>
             <w:r>
               <w:rPr>
@@ -394,7 +394,7 @@
               <w:noProof/>
             </w:rPr>
           </w:pPr>
-          <w:hyperlink w:anchor="_Toc243773525" w:history="1">
+          <w:hyperlink w:anchor="_Toc243783598" w:history="1">
             <w:r>
               <w:rPr>
                 <w:rStyle w:val="Hyperlink"/>
@@ -418,7 +418,7 @@
               <w:rPr>
                 <w:noProof/>
               </w:rPr>
-              <w:instrText xml:space="preserve"> PAGEREF _Toc243773525 \h </w:instrText>
+              <w:instrText xml:space="preserve"> PAGEREF _Toc243783598 \h </w:instrText>
             </w:r>
             <w:r>
               <w:rPr>
@@ -455,7 +455,7 @@
               <w:noProof/>
             </w:rPr>
           </w:pPr>
-          <w:hyperlink w:anchor="_Toc243773526" w:history="1">
+          <w:hyperlink w:anchor="_Toc243783599" w:history="1">
             <w:r>
               <w:rPr>
                 <w:rStyle w:val="Hyperlink"/>
@@ -479,7 +479,7 @@
               <w:rPr>
                 <w:noProof/>
               </w:rPr>
-              <w:instrText xml:space="preserve"> PAGEREF _Toc243773526 \h </w:instrText>
+              <w:instrText xml:space="preserve"> PAGEREF _Toc243783599 \h </w:instrText>
             </w:r>
             <w:r>
               <w:rPr>
@@ -516,7 +516,7 @@
               <w:noProof/>
             </w:rPr>
           </w:pPr>
-          <w:hyperlink w:anchor="_Toc243773527" w:history="1">
+          <w:hyperlink w:anchor="_Toc243783600" w:history="1">
             <w:r>
               <w:rPr>
                 <w:rStyle w:val="Hyperlink"/>
@@ -540,7 +540,7 @@
               <w:rPr>
                 <w:noProof/>
               </w:rPr>
-              <w:instrText xml:space="preserve"> PAGEREF _Toc243773527 \h </w:instrText>
+              <w:instrText xml:space="preserve"> PAGEREF _Toc243783600 \h </w:instrText>
             </w:r>
             <w:r>
               <w:rPr>
@@ -577,7 +577,7 @@
               <w:noProof/>
             </w:rPr>
           </w:pPr>
-          <w:hyperlink w:anchor="_Toc243773528" w:history="1">
+          <w:hyperlink w:anchor="_Toc243783601" w:history="1">
             <w:r>
               <w:rPr>
                 <w:rStyle w:val="Hyperlink"/>
@@ -601,7 +601,7 @@
               <w:rPr>
                 <w:noProof/>
               </w:rPr>
-              <w:instrText xml:space="preserve"> PAGEREF _Toc243773528 \h </w:instrText>
+              <w:instrText xml:space="preserve"> PAGEREF _Toc243783601 \h </w:instrText>
             </w:r>
             <w:r>
               <w:rPr>
@@ -638,7 +638,7 @@
               <w:noProof/>
             </w:rPr>
           </w:pPr>
-          <w:hyperlink w:anchor="_Toc243773529" w:history="1">
+          <w:hyperlink w:anchor="_Toc243783602" w:history="1">
             <w:r>
               <w:rPr>
                 <w:rStyle w:val="Hyperlink"/>
@@ -662,7 +662,7 @@
               <w:rPr>
                 <w:noProof/>
               </w:rPr>
-              <w:instrText xml:space="preserve"> PAGEREF _Toc243773529 \h </w:instrText>
+              <w:instrText xml:space="preserve"> PAGEREF _Toc243783602 \h </w:instrText>
             </w:r>
             <w:r>
               <w:rPr>
@@ -699,7 +699,7 @@
               <w:noProof/>
             </w:rPr>
           </w:pPr>
-          <w:hyperlink w:anchor="_Toc243773530" w:history="1">
+          <w:hyperlink w:anchor="_Toc243783603" w:history="1">
             <w:r>
               <w:rPr>
                 <w:rStyle w:val="Hyperlink"/>
@@ -723,7 +723,7 @@
               <w:rPr>
                 <w:noProof/>
               </w:rPr>
-              <w:instrText xml:space="preserve"> PAGEREF _Toc243773530 \h </w:instrText>
+              <w:instrText xml:space="preserve"> PAGEREF _Toc243783603 \h </w:instrText>
             </w:r>
             <w:r>
               <w:rPr>
@@ -760,7 +760,7 @@
               <w:noProof/>
             </w:rPr>
           </w:pPr>
-          <w:hyperlink w:anchor="_Toc243773531" w:history="1">
+          <w:hyperlink w:anchor="_Toc243783604" w:history="1">
             <w:r>
               <w:rPr>
                 <w:rStyle w:val="Hyperlink"/>
@@ -784,7 +784,7 @@
               <w:rPr>
                 <w:noProof/>
               </w:rPr>
-              <w:instrText xml:space="preserve"> PAGEREF _Toc243773531 \h </w:instrText>
+              <w:instrText xml:space="preserve"> PAGEREF _Toc243783604 \h </w:instrText>
             </w:r>
             <w:r>
               <w:rPr>
@@ -821,7 +821,7 @@
               <w:noProof/>
             </w:rPr>
           </w:pPr>
-          <w:hyperlink w:anchor="_Toc243773532" w:history="1">
+          <w:hyperlink w:anchor="_Toc243783605" w:history="1">
             <w:r>
               <w:rPr>
                 <w:rStyle w:val="Hyperlink"/>
@@ -845,7 +845,7 @@
               <w:rPr>
                 <w:noProof/>
               </w:rPr>
-              <w:instrText xml:space="preserve"> PAGEREF _Toc243773532 \h </w:instrText>
+              <w:instrText xml:space="preserve"> PAGEREF _Toc243783605 \h </w:instrText>
             </w:r>
             <w:r>
               <w:rPr>
@@ -882,7 +882,7 @@
               <w:noProof/>
             </w:rPr>
           </w:pPr>
-          <w:hyperlink w:anchor="_Toc243773533" w:history="1">
+          <w:hyperlink w:anchor="_Toc243783606" w:history="1">
             <w:r>
               <w:rPr>
                 <w:rStyle w:val="Hyperlink"/>
@@ -906,7 +906,7 @@
               <w:rPr>
                 <w:noProof/>
               </w:rPr>
-              <w:instrText xml:space="preserve"> PAGEREF _Toc243773533 \h </w:instrText>
+              <w:instrText xml:space="preserve"> PAGEREF _Toc243783606 \h </w:instrText>
             </w:r>
             <w:r>
               <w:rPr>
@@ -943,7 +943,7 @@
               <w:noProof/>
             </w:rPr>
           </w:pPr>
-          <w:hyperlink w:anchor="_Toc243773534" w:history="1">
+          <w:hyperlink w:anchor="_Toc243783607" w:history="1">
             <w:r>
               <w:rPr>
                 <w:rStyle w:val="Hyperlink"/>
@@ -967,7 +967,7 @@
               <w:rPr>
                 <w:noProof/>
               </w:rPr>
-              <w:instrText xml:space="preserve"> PAGEREF _Toc243773534 \h </w:instrText>
+              <w:instrText xml:space="preserve"> PAGEREF _Toc243783607 \h </w:instrText>
             </w:r>
             <w:r>
               <w:rPr>
@@ -1004,7 +1004,7 @@
               <w:noProof/>
             </w:rPr>
           </w:pPr>
-          <w:hyperlink w:anchor="_Toc243773535" w:history="1">
+          <w:hyperlink w:anchor="_Toc243783608" w:history="1">
             <w:r>
               <w:rPr>
                 <w:rStyle w:val="Hyperlink"/>
@@ -1028,7 +1028,7 @@
               <w:rPr>
                 <w:noProof/>
               </w:rPr>
-              <w:instrText xml:space="preserve"> PAGEREF _Toc243773535 \h </w:instrText>
+              <w:instrText xml:space="preserve"> PAGEREF _Toc243783608 \h </w:instrText>
             </w:r>
             <w:r>
               <w:rPr>
@@ -1065,7 +1065,7 @@
               <w:noProof/>
             </w:rPr>
           </w:pPr>
-          <w:hyperlink w:anchor="_Toc243773536" w:history="1">
+          <w:hyperlink w:anchor="_Toc243783609" w:history="1">
             <w:r>
               <w:rPr>
                 <w:rStyle w:val="Hyperlink"/>
@@ -1089,7 +1089,7 @@
               <w:rPr>
                 <w:noProof/>
               </w:rPr>
-              <w:instrText xml:space="preserve"> PAGEREF _Toc243773536 \h </w:instrText>
+              <w:instrText xml:space="preserve"> PAGEREF _Toc243783609 \h </w:instrText>
             </w:r>
             <w:r>
               <w:rPr>
@@ -1126,7 +1126,7 @@
               <w:noProof/>
             </w:rPr>
           </w:pPr>
-          <w:hyperlink w:anchor="_Toc243773537" w:history="1">
+          <w:hyperlink w:anchor="_Toc243783610" w:history="1">
             <w:r>
               <w:rPr>
                 <w:rStyle w:val="Hyperlink"/>
@@ -1150,7 +1150,7 @@
               <w:rPr>
                 <w:noProof/>
               </w:rPr>
-              <w:instrText xml:space="preserve"> PAGEREF _Toc243773537 \h </w:instrText>
+              <w:instrText xml:space="preserve"> PAGEREF _Toc243783610 \h </w:instrText>
             </w:r>
             <w:r>
               <w:rPr>
@@ -1187,7 +1187,7 @@
               <w:noProof/>
             </w:rPr>
           </w:pPr>
-          <w:hyperlink w:anchor="_Toc243773538" w:history="1">
+          <w:hyperlink w:anchor="_Toc243783611" w:history="1">
             <w:r>
               <w:rPr>
                 <w:rStyle w:val="Hyperlink"/>
@@ -1211,7 +1211,7 @@
               <w:rPr>
                 <w:noProof/>
               </w:rPr>
-              <w:instrText xml:space="preserve"> PAGEREF _Toc243773538 \h </w:instrText>
+              <w:instrText xml:space="preserve"> PAGEREF _Toc243783611 \h </w:instrText>
             </w:r>
             <w:r>
               <w:rPr>
@@ -1248,7 +1248,7 @@
               <w:noProof/>
             </w:rPr>
           </w:pPr>
-          <w:hyperlink w:anchor="_Toc243773539" w:history="1">
+          <w:hyperlink w:anchor="_Toc243783612" w:history="1">
             <w:r>
               <w:rPr>
                 <w:rStyle w:val="Hyperlink"/>
@@ -1272,7 +1272,7 @@
               <w:rPr>
                 <w:noProof/>
               </w:rPr>
-              <w:instrText xml:space="preserve"> PAGEREF _Toc243773539 \h </w:instrText>
+              <w:instrText xml:space="preserve"> PAGEREF _Toc243783612 \h </w:instrText>
             </w:r>
             <w:r>
               <w:rPr>
@@ -1309,7 +1309,7 @@
               <w:noProof/>
             </w:rPr>
           </w:pPr>
-          <w:hyperlink w:anchor="_Toc243773540" w:history="1">
+          <w:hyperlink w:anchor="_Toc243783613" w:history="1">
             <w:r>
               <w:rPr>
                 <w:rStyle w:val="Hyperlink"/>
@@ -1333,7 +1333,7 @@
               <w:rPr>
                 <w:noProof/>
               </w:rPr>
-              <w:instrText xml:space="preserve"> PAGEREF _Toc243773540 \h </w:instrText>
+              <w:instrText xml:space="preserve"> PAGEREF _Toc243783613 \h </w:instrText>
             </w:r>
             <w:r>
               <w:rPr>
@@ -1370,7 +1370,7 @@
               <w:noProof/>
             </w:rPr>
           </w:pPr>
-          <w:hyperlink w:anchor="_Toc243773541" w:history="1">
+          <w:hyperlink w:anchor="_Toc243783614" w:history="1">
             <w:r>
               <w:rPr>
                 <w:rStyle w:val="Hyperlink"/>
@@ -1394,7 +1394,7 @@
               <w:rPr>
                 <w:noProof/>
               </w:rPr>
-              <w:instrText xml:space="preserve"> PAGEREF _Toc243773541 \h </w:instrText>
+              <w:instrText xml:space="preserve"> PAGEREF _Toc243783614 \h </w:instrText>
             </w:r>
             <w:r>
               <w:rPr>
@@ -1431,7 +1431,7 @@
               <w:noProof/>
             </w:rPr>
           </w:pPr>
-          <w:hyperlink w:anchor="_Toc243773542" w:history="1">
+          <w:hyperlink w:anchor="_Toc243783615" w:history="1">
             <w:r>
               <w:rPr>
                 <w:rStyle w:val="Hyperlink"/>
@@ -1455,7 +1455,7 @@
               <w:rPr>
                 <w:noProof/>
               </w:rPr>
-              <w:instrText xml:space="preserve"> PAGEREF _Toc243773542 \h </w:instrText>
+              <w:instrText xml:space="preserve"> PAGEREF _Toc243783615 \h </w:instrText>
             </w:r>
             <w:r>
               <w:rPr>
@@ -1498,7 +1498,7 @@
       <w:pPr>
         <w:pStyle w:val="Heading1"/>
       </w:pPr>
-      <w:bookmarkStart w:id="0" w:name="_Toc243773522"/>
+      <w:bookmarkStart w:id="0" w:name="_Toc243783595"/>
       <w:r>
         <w:t>Part A: Improving the HTTP API</w:t>
       </w:r>
@@ -1509,7 +1509,7 @@
         <w:pStyle w:val="Heading2"/>
         <w:keepNext/>
       </w:pPr>
-      <w:bookmarkStart w:id="1" w:name="_Toc243773523"/>
+      <w:bookmarkStart w:id="1" w:name="_Toc243783596"/>
       <w:r>
         <w:t>A.1 REST constraints</w:t>
       </w:r>
@@ -2350,7 +2350,7 @@
         <w:pStyle w:val="Heading2"/>
         <w:keepNext/>
       </w:pPr>
-      <w:bookmarkStart w:id="2" w:name="_Toc243773524"/>
+      <w:bookmarkStart w:id="2" w:name="_Toc243783597"/>
       <w:r>
         <w:t>A.2 Endpoint review</w:t>
       </w:r>
@@ -2686,7 +2686,7 @@
         <w:pStyle w:val="Heading2"/>
         <w:keepNext/>
       </w:pPr>
-      <w:bookmarkStart w:id="3" w:name="_Toc243773525"/>
+      <w:bookmarkStart w:id="3" w:name="_Toc243783598"/>
       <w:r>
         <w:t>A.3 OpenAPI specification</w:t>
       </w:r>
@@ -2935,7 +2935,7 @@
           <w:noProof/>
         </w:rPr>
         <w:drawing>
-          <wp:inline distT="0" distB="0" distL="0" distR="0" wp14:anchorId="1AD00B95" wp14:editId="1AD00B96">
+          <wp:inline distT="0" distB="0" distL="0" distR="0" wp14:anchorId="3BFE32EB" wp14:editId="3BFE32EC">
             <wp:extent cx="4953000" cy="4619625"/>
             <wp:effectExtent l="0" t="0" r="0" b="0"/>
             <wp:docPr id="1" name="Picture 1"/>
@@ -2999,7 +2999,7 @@
           <w:noProof/>
         </w:rPr>
         <w:drawing>
-          <wp:inline distT="0" distB="0" distL="0" distR="0" wp14:anchorId="1AD00B97" wp14:editId="1AD00B98">
+          <wp:inline distT="0" distB="0" distL="0" distR="0" wp14:anchorId="3BFE32ED" wp14:editId="3BFE32EE">
             <wp:extent cx="5334000" cy="2771775"/>
             <wp:effectExtent l="0" t="0" r="0" b="0"/>
             <wp:docPr id="2" name="Picture 2"/>
@@ -3058,7 +3058,7 @@
         <w:pStyle w:val="Heading2"/>
         <w:keepNext/>
       </w:pPr>
-      <w:bookmarkStart w:id="4" w:name="_Toc243773526"/>
+      <w:bookmarkStart w:id="4" w:name="_Toc243783599"/>
       <w:r>
         <w:t>A.4 Idempotency (safe repeats)</w:t>
       </w:r>
@@ -3297,7 +3297,7 @@
         <w:pStyle w:val="Heading2"/>
         <w:keepNext/>
       </w:pPr>
-      <w:bookmarkStart w:id="5" w:name="_Toc243773527"/>
+      <w:bookmarkStart w:id="5" w:name="_Toc243783600"/>
       <w:r>
         <w:t>A.5 Rate limiting</w:t>
       </w:r>
@@ -3979,7 +3979,7 @@
         <w:pStyle w:val="Heading2"/>
         <w:keepNext/>
       </w:pPr>
-      <w:bookmarkStart w:id="6" w:name="_Toc243773528"/>
+      <w:bookmarkStart w:id="6" w:name="_Toc243783601"/>
       <w:r>
         <w:t>A.6 Before and after: logging a set</w:t>
       </w:r>
@@ -6479,7 +6479,7 @@
         <w:pStyle w:val="Heading2"/>
         <w:keepNext/>
       </w:pPr>
-      <w:bookmarkStart w:id="7" w:name="_Toc243773529"/>
+      <w:bookmarkStart w:id="7" w:name="_Toc243783602"/>
       <w:r>
         <w:t>A.7 The Python caller (timeout, retry, circuit breaker)</w:t>
       </w:r>
@@ -8592,7 +8592,7 @@
       <w:pPr>
         <w:pStyle w:val="Heading1"/>
       </w:pPr>
-      <w:bookmarkStart w:id="8" w:name="_Toc243773530"/>
+      <w:bookmarkStart w:id="8" w:name="_Toc243783603"/>
       <w:r>
         <w:t>Part B: The gRPC service</w:t>
       </w:r>
@@ -8603,7 +8603,7 @@
         <w:pStyle w:val="Heading2"/>
         <w:keepNext/>
       </w:pPr>
-      <w:bookmarkStart w:id="9" w:name="_Toc243773531"/>
+      <w:bookmarkStart w:id="9" w:name="_Toc243783604"/>
       <w:r>
         <w:t>B.1 The operation and where it runs</w:t>
       </w:r>
@@ -8802,7 +8802,7 @@
         <w:pStyle w:val="Heading2"/>
         <w:keepNext/>
       </w:pPr>
-      <w:bookmarkStart w:id="10" w:name="_Toc243773532"/>
+      <w:bookmarkStart w:id="10" w:name="_Toc243783605"/>
       <w:r>
         <w:t>B.2 Contract and generated code</w:t>
       </w:r>
@@ -9300,7 +9300,7 @@
         <w:pStyle w:val="Heading2"/>
         <w:keepNext/>
       </w:pPr>
-      <w:bookmarkStart w:id="11" w:name="_Toc243773533"/>
+      <w:bookmarkStart w:id="11" w:name="_Toc243783606"/>
       <w:r>
         <w:t>B.3 The gRPC client</w:t>
       </w:r>
@@ -9408,7 +9408,7 @@
         <w:pStyle w:val="Heading2"/>
         <w:keepNext/>
       </w:pPr>
-      <w:bookmarkStart w:id="12" w:name="_Toc243773534"/>
+      <w:bookmarkStart w:id="12" w:name="_Toc243783607"/>
       <w:r>
         <w:t>B.4 Success and failure through both versions</w:t>
       </w:r>
@@ -11183,7 +11183,7 @@
         <w:pStyle w:val="Heading2"/>
         <w:keepNext/>
       </w:pPr>
-      <w:bookmarkStart w:id="13" w:name="_Toc243773535"/>
+      <w:bookmarkStart w:id="13" w:name="_Toc243783608"/>
       <w:r>
         <w:t>B.5 Call paths</w:t>
       </w:r>
@@ -11199,7 +11199,7 @@
           <w:noProof/>
         </w:rPr>
         <w:drawing>
-          <wp:inline distT="0" distB="0" distL="0" distR="0" wp14:anchorId="1AD00B99" wp14:editId="1AD00B9A">
+          <wp:inline distT="0" distB="0" distL="0" distR="0" wp14:anchorId="3BFE32EF" wp14:editId="3BFE32F0">
             <wp:extent cx="5715000" cy="3733800"/>
             <wp:effectExtent l="0" t="0" r="0" b="0"/>
             <wp:docPr id="3" name="Picture 3"/>
@@ -11258,7 +11258,7 @@
         <w:pStyle w:val="Heading2"/>
         <w:keepNext/>
       </w:pPr>
-      <w:bookmarkStart w:id="14" w:name="_Toc243773536"/>
+      <w:bookmarkStart w:id="14" w:name="_Toc243783609"/>
       <w:r>
         <w:t>B.6 Logs and trace correlation across the gRPC boundary</w:t>
       </w:r>
@@ -11496,7 +11496,7 @@
           <w:noProof/>
         </w:rPr>
         <w:drawing>
-          <wp:inline distT="0" distB="0" distL="0" distR="0" wp14:anchorId="1AD00B9B" wp14:editId="1AD00B9C">
+          <wp:inline distT="0" distB="0" distL="0" distR="0" wp14:anchorId="3BFE32F1" wp14:editId="3BFE32F2">
             <wp:extent cx="5715000" cy="3190875"/>
             <wp:effectExtent l="0" t="0" r="0" b="0"/>
             <wp:docPr id="4" name="Picture 4"/>
@@ -11559,7 +11559,7 @@
       <w:pPr>
         <w:pStyle w:val="Heading1"/>
       </w:pPr>
-      <w:bookmarkStart w:id="15" w:name="_Toc243773537"/>
+      <w:bookmarkStart w:id="15" w:name="_Toc243783610"/>
       <w:r>
         <w:t>Part C: Extending the metrics</w:t>
       </w:r>
@@ -11570,7 +11570,7 @@
         <w:pStyle w:val="Heading2"/>
         <w:keepNext/>
       </w:pPr>
-      <w:bookmarkStart w:id="16" w:name="_Toc243773538"/>
+      <w:bookmarkStart w:id="16" w:name="_Toc243783611"/>
       <w:r>
         <w:t>C.1 Audit of the Assignment 1 metrics</w:t>
       </w:r>
@@ -12344,7 +12344,7 @@
         <w:pStyle w:val="Heading2"/>
         <w:keepNext/>
       </w:pPr>
-      <w:bookmarkStart w:id="17" w:name="_Toc243773539"/>
+      <w:bookmarkStart w:id="17" w:name="_Toc243783612"/>
       <w:r>
         <w:t>C.2 New metrics</w:t>
       </w:r>
@@ -14092,7 +14092,7 @@
         <w:pStyle w:val="Heading2"/>
         <w:keepNext/>
       </w:pPr>
-      <w:bookmarkStart w:id="18" w:name="_Toc243773540"/>
+      <w:bookmarkStart w:id="18" w:name="_Toc243783613"/>
       <w:r>
         <w:t>C.3 Prometheus and Grafana</w:t>
       </w:r>
@@ -14615,7 +14615,7 @@
           <w:noProof/>
         </w:rPr>
         <w:drawing>
-          <wp:inline distT="0" distB="0" distL="0" distR="0" wp14:anchorId="1AD00B9D" wp14:editId="1AD00B9E">
+          <wp:inline distT="0" distB="0" distL="0" distR="0" wp14:anchorId="3BFE32F3" wp14:editId="3BFE32F4">
             <wp:extent cx="5715000" cy="1790700"/>
             <wp:effectExtent l="0" t="0" r="0" b="0"/>
             <wp:docPr id="5" name="Picture 5"/>
@@ -14679,7 +14679,7 @@
           <w:noProof/>
         </w:rPr>
         <w:drawing>
-          <wp:inline distT="0" distB="0" distL="0" distR="0" wp14:anchorId="1AD00B9F" wp14:editId="1AD00BA0">
+          <wp:inline distT="0" distB="0" distL="0" distR="0" wp14:anchorId="3BFE32F5" wp14:editId="3BFE32F6">
             <wp:extent cx="5715000" cy="4819650"/>
             <wp:effectExtent l="0" t="0" r="0" b="0"/>
             <wp:docPr id="6" name="Picture 6"/>
@@ -14857,7 +14857,7 @@
       <w:pPr>
         <w:pStyle w:val="Heading1"/>
       </w:pPr>
-      <w:bookmarkStart w:id="19" w:name="_Toc243773541"/>
+      <w:bookmarkStart w:id="19" w:name="_Toc243783614"/>
       <w:r>
         <w:t>Submission contents</w:t>
       </w:r>
@@ -15851,7 +15851,7 @@
         <w:pStyle w:val="Heading2"/>
         <w:keepNext/>
       </w:pPr>
-      <w:bookmarkStart w:id="20" w:name="_Toc243773542"/>
+      <w:bookmarkStart w:id="20" w:name="_Toc243783615"/>
       <w:r>
         <w:t>References and reused work</w:t>
       </w:r>
@@ -15927,19 +15927,6 @@
       </w:r>
       <w:r>
         <w:t>).</w:t>
-      </w:r>
-    </w:p>
-    <w:p>
-      <w:pPr>
-        <w:pStyle w:val="ListParagraph"/>
-        <w:numPr>
-          <w:ilvl w:val="0"/>
-          <w:numId w:val="2"/>
-        </w:numPr>
-        <w:spacing w:after="60"/>
-      </w:pPr>
-      <w:r>
-        <w:t>The course gRPC workshop was available as a reference. [Confirm and cite here if any of its code or structure was reused.]</w:t>
       </w:r>
     </w:p>
     <w:p>
@@ -16058,10 +16045,10 @@
 <file path=word/numbering.xml><?xml version="1.0" encoding="utf-8"?>
 <w:numbering xmlns:wpc="http://schemas.microsoft.com/office/word/2010/wordprocessingCanvas" xmlns:cx="http://schemas.microsoft.com/office/drawing/2014/chartex" xmlns:cx1="http://schemas.microsoft.com/office/drawing/2015/9/8/chartex" xmlns:cx2="http://schemas.microsoft.com/office/drawing/2015/10/21/chartex" xmlns:cx3="http://schemas.microsoft.com/office/drawing/2016/5/9/chartex" xmlns:cx4="http://schemas.microsoft.com/office/drawing/2016/5/10/chartex" xmlns:cx5="http://schemas.microsoft.com/office/drawing/2016/5/11/chartex" xmlns:cx6="http://schemas.microsoft.com/office/drawing/2016/5/12/chartex" xmlns:cx7="http://schemas.microsoft.com/office/drawing/2016/5/13/chartex" xmlns:cx8="http://schemas.microsoft.com/office/drawing/2016/5/14/chartex" xmlns:mc="http://schemas.openxmlformats.org/markup-compatibility/2006" xmlns:aink="http://schemas.microsoft.com/office/drawing/2016/ink" xmlns:am3d="http://schemas.microsoft.com/office/drawing/2017/model3d" xmlns:o="urn:schemas-microsoft-com:office:office" xmlns:oel="http://schemas.microsoft.com/office/2019/extlst" xmlns:r="http://schemas.openxmlformats.org/officeDocument/2006/relationships" xmlns:m="http://schemas.openxmlformats.org/officeDocument/2006/math" xmlns:v="urn:schemas-microsoft-com:vml" xmlns:wp14="http://schemas.microsoft.com/office/word/2010/wordprocessingDrawing" xmlns:wp="http://schemas.openxmlformats.org/drawingml/2006/wordprocessingDrawing" xmlns:w10="urn:schemas-microsoft-com:office:word" xmlns:w="http://schemas.openxmlformats.org/wordprocessingml/2006/main" xmlns:w14="http://schemas.microsoft.com/office/word/2010/wordml" xmlns:w15="http://schemas.microsoft.com/office/word/2012/wordml" xmlns:w16cex="http://schemas.microsoft.com/office/word/2018/wordml/cex" xmlns:w16cid="http://schemas.microsoft.com/office/word/2016/wordml/cid" xmlns:w16="http://schemas.microsoft.com/office/word/2018/wordml" xmlns:w16du="http://schemas.microsoft.com/office/word/2023/wordml/word16du" xmlns:w16sdtdh="http://schemas.microsoft.com/office/word/2020/wordml/sdtdatahash" xmlns:w16sdtfl="http://schemas.microsoft.com/office/word/2024/wordml/sdtformatlock" xmlns:w16se="http://schemas.microsoft.com/office/word/2015/wordml/symex" xmlns:wpg="http://schemas.microsoft.com/office/word/2010/wordprocessingGroup" xmlns:wpi="http://schemas.microsoft.com/office/word/2010/wordprocessingInk" xmlns:wne="http://schemas.microsoft.com/office/word/2006/wordml" xmlns:wps="http://schemas.microsoft.com/office/word/2010/wordprocessingShape" mc:Ignorable="w14 w15 w16se w16cid w16 w16cex w16sdtdh w16sdtfl w16du wp14">
   <w:abstractNum w:abstractNumId="0" w15:restartNumberingAfterBreak="0">
-    <w:nsid w:val="39F77C16"/>
+    <w:nsid w:val="21932FBF"/>
     <w:multiLevelType w:val="hybridMultilevel"/>
-    <w:tmpl w:val="DE5E3BF0"/>
-    <w:lvl w:ilvl="0" w:tplc="DD9670FE" w:tentative="1">
+    <w:tmpl w:val="BB261402"/>
+    <w:lvl w:ilvl="0" w:tplc="EB8ACB98" w:tentative="1">
       <w:start w:val="1"/>
       <w:numFmt w:val="bullet"/>
       <w:lvlText w:val="●"/>
@@ -16070,7 +16057,7 @@
         <w:ind w:left="720" w:hanging="360"/>
       </w:pPr>
     </w:lvl>
-    <w:lvl w:ilvl="1" w:tplc="2130825E" w:tentative="1">
+    <w:lvl w:ilvl="1" w:tplc="40241E58" w:tentative="1">
       <w:start w:val="1"/>
       <w:numFmt w:val="bullet"/>
       <w:lvlText w:val="○"/>
@@ -16079,7 +16066,7 @@
         <w:ind w:left="1440" w:hanging="360"/>
       </w:pPr>
     </w:lvl>
-    <w:lvl w:ilvl="2" w:tplc="F85A567C" w:tentative="1">
+    <w:lvl w:ilvl="2" w:tplc="7CA08A00" w:tentative="1">
       <w:start w:val="1"/>
       <w:numFmt w:val="bullet"/>
       <w:lvlText w:val="■"/>
@@ -16088,7 +16075,7 @@
         <w:ind w:left="2160" w:hanging="360"/>
       </w:pPr>
     </w:lvl>
-    <w:lvl w:ilvl="3" w:tplc="5A62B3A2" w:tentative="1">
+    <w:lvl w:ilvl="3" w:tplc="95A6AFD6" w:tentative="1">
       <w:start w:val="1"/>
       <w:numFmt w:val="bullet"/>
       <w:lvlText w:val="●"/>
@@ -16097,7 +16084,7 @@
         <w:ind w:left="2880" w:hanging="360"/>
       </w:pPr>
     </w:lvl>
-    <w:lvl w:ilvl="4" w:tplc="FD8EDF0E" w:tentative="1">
+    <w:lvl w:ilvl="4" w:tplc="3BB4CBD6" w:tentative="1">
       <w:start w:val="1"/>
       <w:numFmt w:val="bullet"/>
       <w:lvlText w:val="○"/>
@@ -16106,7 +16093,7 @@
         <w:ind w:left="3600" w:hanging="360"/>
       </w:pPr>
     </w:lvl>
-    <w:lvl w:ilvl="5" w:tplc="A1D04160" w:tentative="1">
+    <w:lvl w:ilvl="5" w:tplc="631EF794" w:tentative="1">
       <w:start w:val="1"/>
       <w:numFmt w:val="bullet"/>
       <w:lvlText w:val="■"/>
@@ -16115,7 +16102,7 @@
         <w:ind w:left="4320" w:hanging="360"/>
       </w:pPr>
     </w:lvl>
-    <w:lvl w:ilvl="6" w:tplc="8664483A" w:tentative="1">
+    <w:lvl w:ilvl="6" w:tplc="8CB8DD8E" w:tentative="1">
       <w:start w:val="1"/>
       <w:numFmt w:val="bullet"/>
       <w:lvlText w:val="●"/>
@@ -16124,7 +16111,7 @@
         <w:ind w:left="5040" w:hanging="360"/>
       </w:pPr>
     </w:lvl>
-    <w:lvl w:ilvl="7" w:tplc="4768E570" w:tentative="1">
+    <w:lvl w:ilvl="7" w:tplc="1C92729C" w:tentative="1">
       <w:start w:val="1"/>
       <w:numFmt w:val="bullet"/>
       <w:lvlText w:val="●"/>
@@ -16133,7 +16120,7 @@
         <w:ind w:left="5760" w:hanging="360"/>
       </w:pPr>
     </w:lvl>
-    <w:lvl w:ilvl="8" w:tplc="7CFE9E90" w:tentative="1">
+    <w:lvl w:ilvl="8" w:tplc="3E7470EC" w:tentative="1">
       <w:start w:val="1"/>
       <w:numFmt w:val="bullet"/>
       <w:lvlText w:val="●"/>
@@ -16144,10 +16131,10 @@
     </w:lvl>
   </w:abstractNum>
   <w:abstractNum w:abstractNumId="1" w15:restartNumberingAfterBreak="0">
-    <w:nsid w:val="7C4D73B2"/>
+    <w:nsid w:val="77BE0144"/>
     <w:multiLevelType w:val="hybridMultilevel"/>
-    <w:tmpl w:val="8ABE1390"/>
-    <w:lvl w:ilvl="0" w:tplc="D72AE15A">
+    <w:tmpl w:val="52EA38D2"/>
+    <w:lvl w:ilvl="0" w:tplc="4306949E">
       <w:start w:val="1"/>
       <w:numFmt w:val="bullet"/>
       <w:lvlText w:val="•"/>
@@ -16156,54 +16143,54 @@
         <w:ind w:left="540" w:hanging="270"/>
       </w:pPr>
     </w:lvl>
-    <w:lvl w:ilvl="1" w:tplc="F0660BA4">
+    <w:lvl w:ilvl="1" w:tplc="0588AAB6">
       <w:numFmt w:val="decimal"/>
       <w:lvlText w:val=""/>
       <w:lvlJc w:val="left"/>
     </w:lvl>
-    <w:lvl w:ilvl="2" w:tplc="D60078E2">
+    <w:lvl w:ilvl="2" w:tplc="931AF528">
       <w:numFmt w:val="decimal"/>
       <w:lvlText w:val=""/>
       <w:lvlJc w:val="left"/>
     </w:lvl>
-    <w:lvl w:ilvl="3" w:tplc="FD0A1D8A">
+    <w:lvl w:ilvl="3" w:tplc="90908AE0">
       <w:numFmt w:val="decimal"/>
       <w:lvlText w:val=""/>
       <w:lvlJc w:val="left"/>
     </w:lvl>
-    <w:lvl w:ilvl="4" w:tplc="B142B9CA">
+    <w:lvl w:ilvl="4" w:tplc="3DBE25F6">
       <w:numFmt w:val="decimal"/>
       <w:lvlText w:val=""/>
       <w:lvlJc w:val="left"/>
     </w:lvl>
-    <w:lvl w:ilvl="5" w:tplc="FE083F4E">
+    <w:lvl w:ilvl="5" w:tplc="C99C1F6C">
       <w:numFmt w:val="decimal"/>
       <w:lvlText w:val=""/>
       <w:lvlJc w:val="left"/>
     </w:lvl>
-    <w:lvl w:ilvl="6" w:tplc="E7240788">
+    <w:lvl w:ilvl="6" w:tplc="F292833A">
       <w:numFmt w:val="decimal"/>
       <w:lvlText w:val=""/>
       <w:lvlJc w:val="left"/>
     </w:lvl>
-    <w:lvl w:ilvl="7" w:tplc="4678F5FE">
+    <w:lvl w:ilvl="7" w:tplc="E9DEB0EC">
       <w:numFmt w:val="decimal"/>
       <w:lvlText w:val=""/>
       <w:lvlJc w:val="left"/>
     </w:lvl>
-    <w:lvl w:ilvl="8" w:tplc="B3EE3090">
+    <w:lvl w:ilvl="8" w:tplc="E3DAC262">
       <w:numFmt w:val="decimal"/>
       <w:lvlText w:val=""/>
       <w:lvlJc w:val="left"/>
     </w:lvl>
   </w:abstractNum>
-  <w:num w:numId="1" w16cid:durableId="228077685">
+  <w:num w:numId="1" w16cid:durableId="1642030624">
     <w:abstractNumId w:val="0"/>
     <w:lvlOverride w:ilvl="0">
       <w:startOverride w:val="1"/>
     </w:lvlOverride>
   </w:num>
-  <w:num w:numId="2" w16cid:durableId="576209362">
+  <w:num w:numId="2" w16cid:durableId="651373221">
     <w:abstractNumId w:val="1"/>
     <w:lvlOverride w:ilvl="0">
       <w:startOverride w:val="1"/>
@@ -16841,7 +16828,7 @@
     <w:autoRedefine/>
     <w:uiPriority w:val="39"/>
     <w:unhideWhenUsed/>
-    <w:rsid w:val="00C73E4A"/>
+    <w:rsid w:val="0087666C"/>
     <w:pPr>
       <w:spacing w:after="100"/>
     </w:pPr>
@@ -16853,7 +16840,7 @@
     <w:autoRedefine/>
     <w:uiPriority w:val="39"/>
     <w:unhideWhenUsed/>
-    <w:rsid w:val="00C73E4A"/>
+    <w:rsid w:val="0087666C"/>
     <w:pPr>
       <w:spacing w:after="100"/>
       <w:ind w:left="210"/>

</xml_diff>